<commit_message>
docs(resume): merge 2021–2023 role, add innovations, tweak tagline
</commit_message>
<xml_diff>
--- a/tools/resume/resume.docx
+++ b/tools/resume/resume.docx
@@ -2,7 +2,7 @@
 <file path=word/document.xml><?xml version="1.0" encoding="utf-8"?>
 <w:document xmlns:w="http://schemas.openxmlformats.org/wordprocessingml/2006/main" xmlns:m="http://schemas.openxmlformats.org/officeDocument/2006/math" xmlns:r="http://schemas.openxmlformats.org/officeDocument/2006/relationships" xmlns:o="urn:schemas-microsoft-com:office:office" xmlns:v="urn:schemas-microsoft-com:vml" xmlns:w10="urn:schemas-microsoft-com:office:word" xmlns:a="http://schemas.openxmlformats.org/drawingml/2006/main" xmlns:pic="http://schemas.openxmlformats.org/drawingml/2006/picture" xmlns:wp="http://schemas.openxmlformats.org/drawingml/2006/wordprocessingDrawing">
   <w:body>
-    <w:bookmarkStart w:id="19" w:name="jon-edwards"/>
+    <w:bookmarkStart w:id="20" w:name="jon-edwards"/>
     <w:p>
       <w:pPr>
         <w:pStyle w:val="Heading1"/>
@@ -14,6 +14,254 @@
     <w:p>
       <w:pPr>
         <w:pStyle w:val="FirstParagraph"/>
+      </w:pPr>
+      <w:r>
+        <w:rPr>
+          <w:b/>
+          <w:bCs/>
+        </w:rPr>
+        <w:t xml:space="preserve">Principal Software Engineer/Engineering Manager</w:t>
+      </w:r>
+    </w:p>
+    <w:p>
+      <w:pPr>
+        <w:pStyle w:val="BodyText"/>
+      </w:pPr>
+      <w:r>
+        <w:rPr>
+          <w:i/>
+          <w:iCs/>
+        </w:rPr>
+        <w:t xml:space="preserve">Product Engineering · Data Platforms · AI · Scaling Systems · Team Leadership</w:t>
+      </w:r>
+    </w:p>
+    <w:p>
+      <w:pPr>
+        <w:pStyle w:val="Compact"/>
+        <w:numPr>
+          <w:ilvl w:val="0"/>
+          <w:numId w:val="1001"/>
+        </w:numPr>
+      </w:pPr>
+      <w:r>
+        <w:t xml:space="preserve">509-8185 • jkedwards@me.com • US Person • Bainbridge Island, WA</w:t>
+      </w:r>
+    </w:p>
+    <w:bookmarkStart w:id="9" w:name="summary"/>
+    <w:p>
+      <w:pPr>
+        <w:pStyle w:val="Heading2"/>
+      </w:pPr>
+      <w:r>
+        <w:t xml:space="preserve">Summary</w:t>
+      </w:r>
+    </w:p>
+    <w:p>
+      <w:pPr>
+        <w:pStyle w:val="FirstParagraph"/>
+      </w:pPr>
+      <w:r>
+        <w:t xml:space="preserve">Principal Software Engineer building streaming data platforms over datasets in the hundreds of millions of records, modernizing developer platforms with Nix and monorepo tooling, and operationalizing AI-assisted engineering practice. In the past year, shipped a Flow-Based Programming data graph (~2.5M events/day and growing), avmbench — a property and people delivery platform that unlocked $1M in net new revenue and new categories of products — and Scala load shedding for a high-traffic search layer. 10+ years bridging deep IC and engineering leadership; has managed teams of up to 12.</w:t>
+      </w:r>
+    </w:p>
+    <w:bookmarkEnd w:id="9"/>
+    <w:bookmarkStart w:id="10" w:name="skills"/>
+    <w:p>
+      <w:pPr>
+        <w:pStyle w:val="Heading2"/>
+      </w:pPr>
+      <w:r>
+        <w:t xml:space="preserve">Skills</w:t>
+      </w:r>
+    </w:p>
+    <w:p>
+      <w:pPr>
+        <w:pStyle w:val="Compact"/>
+        <w:numPr>
+          <w:ilvl w:val="0"/>
+          <w:numId w:val="1002"/>
+        </w:numPr>
+      </w:pPr>
+      <w:r>
+        <w:rPr>
+          <w:b/>
+          <w:bCs/>
+        </w:rPr>
+        <w:t xml:space="preserve">Specialties:</w:t>
+      </w:r>
+      <w:r>
+        <w:t xml:space="preserve"> </w:t>
+      </w:r>
+      <w:r>
+        <w:t xml:space="preserve">streaming data platforms, developer-platform modernization, AI-assisted engineering practice, Flow-Based Programming, distributed data pipelines</w:t>
+      </w:r>
+    </w:p>
+    <w:p>
+      <w:pPr>
+        <w:pStyle w:val="Compact"/>
+        <w:numPr>
+          <w:ilvl w:val="0"/>
+          <w:numId w:val="1002"/>
+        </w:numPr>
+      </w:pPr>
+      <w:r>
+        <w:rPr>
+          <w:b/>
+          <w:bCs/>
+        </w:rPr>
+        <w:t xml:space="preserve">Leadership:</w:t>
+      </w:r>
+      <w:r>
+        <w:t xml:space="preserve"> </w:t>
+      </w:r>
+      <w:r>
+        <w:t xml:space="preserve">team management, mentorship, high-volume substantive code review, engineering governance</w:t>
+      </w:r>
+    </w:p>
+    <w:p>
+      <w:pPr>
+        <w:pStyle w:val="Compact"/>
+        <w:numPr>
+          <w:ilvl w:val="0"/>
+          <w:numId w:val="1002"/>
+        </w:numPr>
+      </w:pPr>
+      <w:r>
+        <w:rPr>
+          <w:b/>
+          <w:bCs/>
+        </w:rPr>
+        <w:t xml:space="preserve">Languages:</w:t>
+      </w:r>
+      <w:r>
+        <w:t xml:space="preserve"> </w:t>
+      </w:r>
+      <w:r>
+        <w:t xml:space="preserve">Python, TypeScript, JavaScript, CUE, Bash; working knowledge of Rust, Scala 2, Java, C#, Kotlin, Swift</w:t>
+      </w:r>
+    </w:p>
+    <w:p>
+      <w:pPr>
+        <w:pStyle w:val="Compact"/>
+        <w:numPr>
+          <w:ilvl w:val="0"/>
+          <w:numId w:val="1002"/>
+        </w:numPr>
+      </w:pPr>
+      <w:r>
+        <w:rPr>
+          <w:b/>
+          <w:bCs/>
+        </w:rPr>
+        <w:t xml:space="preserve">Cloud &amp; Infrastructure:</w:t>
+      </w:r>
+      <w:r>
+        <w:t xml:space="preserve"> </w:t>
+      </w:r>
+      <w:r>
+        <w:t xml:space="preserve">AWS, Kubernetes, Helm, Terraform, Azure</w:t>
+      </w:r>
+    </w:p>
+    <w:p>
+      <w:pPr>
+        <w:pStyle w:val="Compact"/>
+        <w:numPr>
+          <w:ilvl w:val="0"/>
+          <w:numId w:val="1002"/>
+        </w:numPr>
+      </w:pPr>
+      <w:r>
+        <w:rPr>
+          <w:b/>
+          <w:bCs/>
+        </w:rPr>
+        <w:t xml:space="preserve">Build &amp; Deploy:</w:t>
+      </w:r>
+      <w:r>
+        <w:t xml:space="preserve"> </w:t>
+      </w:r>
+      <w:r>
+        <w:t xml:space="preserve">Nix, Docker, monorepos, CI/CD pipelines (GitHub Actions, Jenkins)</w:t>
+      </w:r>
+    </w:p>
+    <w:p>
+      <w:pPr>
+        <w:pStyle w:val="Compact"/>
+        <w:numPr>
+          <w:ilvl w:val="0"/>
+          <w:numId w:val="1002"/>
+        </w:numPr>
+      </w:pPr>
+      <w:r>
+        <w:rPr>
+          <w:b/>
+          <w:bCs/>
+        </w:rPr>
+        <w:t xml:space="preserve">Data &amp; AI:</w:t>
+      </w:r>
+      <w:r>
+        <w:t xml:space="preserve"> </w:t>
+      </w:r>
+      <w:r>
+        <w:t xml:space="preserve">Databricks, Delta Lake, Parquet, PostgreSQL, Redis, Elasticsearch, MCP, Claude API</w:t>
+      </w:r>
+    </w:p>
+    <w:p>
+      <w:pPr>
+        <w:pStyle w:val="Compact"/>
+        <w:numPr>
+          <w:ilvl w:val="0"/>
+          <w:numId w:val="1002"/>
+        </w:numPr>
+      </w:pPr>
+      <w:r>
+        <w:rPr>
+          <w:b/>
+          <w:bCs/>
+        </w:rPr>
+        <w:t xml:space="preserve">Frontend &amp; Mobile:</w:t>
+      </w:r>
+      <w:r>
+        <w:t xml:space="preserve"> </w:t>
+      </w:r>
+      <w:r>
+        <w:t xml:space="preserve">React, Vue, React Native, Angular 2+, Cordova</w:t>
+      </w:r>
+    </w:p>
+    <w:bookmarkEnd w:id="10"/>
+    <w:bookmarkStart w:id="16" w:name="work-experience"/>
+    <w:p>
+      <w:pPr>
+        <w:pStyle w:val="Heading2"/>
+      </w:pPr>
+      <w:r>
+        <w:t xml:space="preserve">Work Experience</w:t>
+      </w:r>
+    </w:p>
+    <w:bookmarkStart w:id="11" w:name="whitepages"/>
+    <w:p>
+      <w:pPr>
+        <w:pStyle w:val="Heading3"/>
+      </w:pPr>
+      <w:r>
+        <w:t xml:space="preserve">Whitepages</w:t>
+      </w:r>
+    </w:p>
+    <w:p>
+      <w:pPr>
+        <w:pStyle w:val="FirstParagraph"/>
+      </w:pPr>
+      <w:r>
+        <w:rPr>
+          <w:i/>
+          <w:iCs/>
+        </w:rPr>
+        <w:t xml:space="preserve">(consumer search platform: 1B+ indexed pages, 10M+ unique users/month)</w:t>
+      </w:r>
+    </w:p>
+    <w:p>
+      <w:pPr>
+        <w:pStyle w:val="BodyText"/>
       </w:pPr>
       <w:r>
         <w:rPr>
@@ -22,254 +270,6 @@
         </w:rPr>
         <w:t xml:space="preserve">Principal Software Engineer</w:t>
       </w:r>
-    </w:p>
-    <w:p>
-      <w:pPr>
-        <w:pStyle w:val="BodyText"/>
-      </w:pPr>
-      <w:r>
-        <w:rPr>
-          <w:i/>
-          <w:iCs/>
-        </w:rPr>
-        <w:t xml:space="preserve">Product Engineering · Data Platforms · AI · Scaling Systems, Growing Engineers</w:t>
-      </w:r>
-    </w:p>
-    <w:p>
-      <w:pPr>
-        <w:pStyle w:val="Compact"/>
-        <w:numPr>
-          <w:ilvl w:val="0"/>
-          <w:numId w:val="1001"/>
-        </w:numPr>
-      </w:pPr>
-      <w:r>
-        <w:t xml:space="preserve">509-8185 • jkedwards@me.com • US Person • Bainbridge Island, WA</w:t>
-      </w:r>
-    </w:p>
-    <w:bookmarkStart w:id="9" w:name="summary"/>
-    <w:p>
-      <w:pPr>
-        <w:pStyle w:val="Heading2"/>
-      </w:pPr>
-      <w:r>
-        <w:t xml:space="preserve">Summary</w:t>
-      </w:r>
-    </w:p>
-    <w:p>
-      <w:pPr>
-        <w:pStyle w:val="FirstParagraph"/>
-      </w:pPr>
-      <w:r>
-        <w:t xml:space="preserve">Principal Software Engineer building streaming data platforms over datasets in the hundreds of millions of records, modernizing developer platforms with Nix and monorepo tooling, and operationalizing AI-assisted engineering practice. In the past year, shipped a Flow-Based Programming data graph (~2.5M events/day and growing), avmbench — a property and people delivery platform that unlocked $1M in net new revenue and new categories of products — and Scala load shedding for a high-traffic search layer. 10+ years bridging deep IC and engineering leadership; has managed teams of up to 12.</w:t>
-      </w:r>
-    </w:p>
-    <w:bookmarkEnd w:id="9"/>
-    <w:bookmarkStart w:id="10" w:name="skills"/>
-    <w:p>
-      <w:pPr>
-        <w:pStyle w:val="Heading2"/>
-      </w:pPr>
-      <w:r>
-        <w:t xml:space="preserve">Skills</w:t>
-      </w:r>
-    </w:p>
-    <w:p>
-      <w:pPr>
-        <w:pStyle w:val="Compact"/>
-        <w:numPr>
-          <w:ilvl w:val="0"/>
-          <w:numId w:val="1002"/>
-        </w:numPr>
-      </w:pPr>
-      <w:r>
-        <w:rPr>
-          <w:b/>
-          <w:bCs/>
-        </w:rPr>
-        <w:t xml:space="preserve">Specialties:</w:t>
-      </w:r>
-      <w:r>
-        <w:t xml:space="preserve"> </w:t>
-      </w:r>
-      <w:r>
-        <w:t xml:space="preserve">streaming data platforms, developer-platform modernization, AI-assisted engineering practice, Flow-Based Programming, distributed data pipelines</w:t>
-      </w:r>
-    </w:p>
-    <w:p>
-      <w:pPr>
-        <w:pStyle w:val="Compact"/>
-        <w:numPr>
-          <w:ilvl w:val="0"/>
-          <w:numId w:val="1002"/>
-        </w:numPr>
-      </w:pPr>
-      <w:r>
-        <w:rPr>
-          <w:b/>
-          <w:bCs/>
-        </w:rPr>
-        <w:t xml:space="preserve">Leadership:</w:t>
-      </w:r>
-      <w:r>
-        <w:t xml:space="preserve"> </w:t>
-      </w:r>
-      <w:r>
-        <w:t xml:space="preserve">team management, mentorship, high-volume substantive code review, engineering governance</w:t>
-      </w:r>
-    </w:p>
-    <w:p>
-      <w:pPr>
-        <w:pStyle w:val="Compact"/>
-        <w:numPr>
-          <w:ilvl w:val="0"/>
-          <w:numId w:val="1002"/>
-        </w:numPr>
-      </w:pPr>
-      <w:r>
-        <w:rPr>
-          <w:b/>
-          <w:bCs/>
-        </w:rPr>
-        <w:t xml:space="preserve">Languages:</w:t>
-      </w:r>
-      <w:r>
-        <w:t xml:space="preserve"> </w:t>
-      </w:r>
-      <w:r>
-        <w:t xml:space="preserve">Python, TypeScript, JavaScript, CUE, Bash; working knowledge of Rust, Scala 2, Java, C#, Kotlin, Swift</w:t>
-      </w:r>
-    </w:p>
-    <w:p>
-      <w:pPr>
-        <w:pStyle w:val="Compact"/>
-        <w:numPr>
-          <w:ilvl w:val="0"/>
-          <w:numId w:val="1002"/>
-        </w:numPr>
-      </w:pPr>
-      <w:r>
-        <w:rPr>
-          <w:b/>
-          <w:bCs/>
-        </w:rPr>
-        <w:t xml:space="preserve">Cloud &amp; Infrastructure:</w:t>
-      </w:r>
-      <w:r>
-        <w:t xml:space="preserve"> </w:t>
-      </w:r>
-      <w:r>
-        <w:t xml:space="preserve">AWS, Kubernetes, Helm, Terraform, Azure</w:t>
-      </w:r>
-    </w:p>
-    <w:p>
-      <w:pPr>
-        <w:pStyle w:val="Compact"/>
-        <w:numPr>
-          <w:ilvl w:val="0"/>
-          <w:numId w:val="1002"/>
-        </w:numPr>
-      </w:pPr>
-      <w:r>
-        <w:rPr>
-          <w:b/>
-          <w:bCs/>
-        </w:rPr>
-        <w:t xml:space="preserve">Build &amp; Deploy:</w:t>
-      </w:r>
-      <w:r>
-        <w:t xml:space="preserve"> </w:t>
-      </w:r>
-      <w:r>
-        <w:t xml:space="preserve">Nix, Docker, monorepos, CI/CD pipelines (GitHub Actions, Jenkins)</w:t>
-      </w:r>
-    </w:p>
-    <w:p>
-      <w:pPr>
-        <w:pStyle w:val="Compact"/>
-        <w:numPr>
-          <w:ilvl w:val="0"/>
-          <w:numId w:val="1002"/>
-        </w:numPr>
-      </w:pPr>
-      <w:r>
-        <w:rPr>
-          <w:b/>
-          <w:bCs/>
-        </w:rPr>
-        <w:t xml:space="preserve">Data &amp; AI:</w:t>
-      </w:r>
-      <w:r>
-        <w:t xml:space="preserve"> </w:t>
-      </w:r>
-      <w:r>
-        <w:t xml:space="preserve">Databricks, Delta Lake, Parquet, PostgreSQL, Redis, Elasticsearch, MCP, Claude API</w:t>
-      </w:r>
-    </w:p>
-    <w:p>
-      <w:pPr>
-        <w:pStyle w:val="Compact"/>
-        <w:numPr>
-          <w:ilvl w:val="0"/>
-          <w:numId w:val="1002"/>
-        </w:numPr>
-      </w:pPr>
-      <w:r>
-        <w:rPr>
-          <w:b/>
-          <w:bCs/>
-        </w:rPr>
-        <w:t xml:space="preserve">Frontend &amp; Mobile:</w:t>
-      </w:r>
-      <w:r>
-        <w:t xml:space="preserve"> </w:t>
-      </w:r>
-      <w:r>
-        <w:t xml:space="preserve">React, Vue, React Native, Angular 2+, Cordova</w:t>
-      </w:r>
-    </w:p>
-    <w:bookmarkEnd w:id="10"/>
-    <w:bookmarkStart w:id="16" w:name="work-experience"/>
-    <w:p>
-      <w:pPr>
-        <w:pStyle w:val="Heading2"/>
-      </w:pPr>
-      <w:r>
-        <w:t xml:space="preserve">Work Experience</w:t>
-      </w:r>
-    </w:p>
-    <w:bookmarkStart w:id="11" w:name="whitepages"/>
-    <w:p>
-      <w:pPr>
-        <w:pStyle w:val="Heading3"/>
-      </w:pPr>
-      <w:r>
-        <w:t xml:space="preserve">Whitepages</w:t>
-      </w:r>
-    </w:p>
-    <w:p>
-      <w:pPr>
-        <w:pStyle w:val="FirstParagraph"/>
-      </w:pPr>
-      <w:r>
-        <w:rPr>
-          <w:i/>
-          <w:iCs/>
-        </w:rPr>
-        <w:t xml:space="preserve">(consumer search platform: 1B+ indexed pages, 10M+ unique users/month)</w:t>
-      </w:r>
-    </w:p>
-    <w:p>
-      <w:pPr>
-        <w:pStyle w:val="BodyText"/>
-      </w:pPr>
-      <w:r>
-        <w:rPr>
-          <w:b/>
-          <w:bCs/>
-        </w:rPr>
-        <w:t xml:space="preserve">Principal Software Engineer</w:t>
-      </w:r>
       <w:r>
         <w:t xml:space="preserve"> </w:t>
       </w:r>
@@ -428,13 +428,13 @@
           <w:b/>
           <w:bCs/>
         </w:rPr>
-        <w:t xml:space="preserve">Engineering Manager</w:t>
+        <w:t xml:space="preserve">Lead Sr. Software Engineer, Engineering Manager</w:t>
       </w:r>
       <w:r>
         <w:t xml:space="preserve"> </w:t>
       </w:r>
       <w:r>
-        <w:t xml:space="preserve">— Aug 2022 – Jun 2023</w:t>
+        <w:t xml:space="preserve">— Dec 2021 – Jun 2023</w:t>
       </w:r>
     </w:p>
     <w:p>
@@ -446,7 +446,7 @@
         </w:numPr>
       </w:pPr>
       <w:r>
-        <w:t xml:space="preserve">Managed and mentored a team of 6 engineers on the consumer web platform (SEO, Core Web Vitals, conversion optimization, GDPR compliance), leading delivery on LCP regression fixes for high-traffic page types, INP tracking ahead of Google’s CWV INP rollout, and an org-wide cookie consent rollout.</w:t>
+        <w:t xml:space="preserve">Reversed a multi-quarter decline in Google indexation, increasing indexed page count by 30%.</w:t>
       </w:r>
     </w:p>
     <w:p>
@@ -458,73 +458,55 @@
         </w:numPr>
       </w:pPr>
       <w:r>
+        <w:t xml:space="preserve">Drove dozens of millions of SERP-indexed URLs from red LCP (Core Web Vitals failure) to zero, with monitoring automation to keep them green.</w:t>
+      </w:r>
+    </w:p>
+    <w:p>
+      <w:pPr>
+        <w:pStyle w:val="Compact"/>
+        <w:numPr>
+          <w:ilvl w:val="0"/>
+          <w:numId w:val="1004"/>
+        </w:numPr>
+      </w:pPr>
+      <w:r>
+        <w:t xml:space="preserve">Increased mobile revenue by 20% YoY by focusing on stability and adding new features.</w:t>
+      </w:r>
+    </w:p>
+    <w:p>
+      <w:pPr>
+        <w:pStyle w:val="Compact"/>
+        <w:numPr>
+          <w:ilvl w:val="0"/>
+          <w:numId w:val="1004"/>
+        </w:numPr>
+      </w:pPr>
+      <w:r>
+        <w:t xml:space="preserve">Lifted mobile app release cadence from every other week to several times per week, focused on SEO performance and mobile feature delivery.</w:t>
+      </w:r>
+    </w:p>
+    <w:p>
+      <w:pPr>
+        <w:pStyle w:val="Compact"/>
+        <w:numPr>
+          <w:ilvl w:val="0"/>
+          <w:numId w:val="1004"/>
+        </w:numPr>
+      </w:pPr>
+      <w:r>
+        <w:t xml:space="preserve">Managed and mentored a team of 6 engineers on the consumer web platform and mobile app team (SEO, Core Web Vitals, conversion optimization, legal compliance), leading delivery on LCP regression fixes for high-traffic page types, INP tracking ahead of Google’s CWV INP rollout, and an org-wide cookie consent rollout.</w:t>
+      </w:r>
+    </w:p>
+    <w:p>
+      <w:pPr>
+        <w:pStyle w:val="Compact"/>
+        <w:numPr>
+          <w:ilvl w:val="0"/>
+          <w:numId w:val="1004"/>
+        </w:numPr>
+      </w:pPr>
+      <w:r>
         <w:t xml:space="preserve">Returned to the IC track in Jun 2023 to focus on data platform architecture.</w:t>
-      </w:r>
-    </w:p>
-    <w:p>
-      <w:pPr>
-        <w:pStyle w:val="FirstParagraph"/>
-      </w:pPr>
-      <w:r>
-        <w:rPr>
-          <w:b/>
-          <w:bCs/>
-        </w:rPr>
-        <w:t xml:space="preserve">Lead Sr. Software Engineer, Web &amp; Mobile Apps</w:t>
-      </w:r>
-      <w:r>
-        <w:t xml:space="preserve"> </w:t>
-      </w:r>
-      <w:r>
-        <w:t xml:space="preserve">— Dec 2021 – Aug 2022</w:t>
-      </w:r>
-    </w:p>
-    <w:p>
-      <w:pPr>
-        <w:pStyle w:val="Compact"/>
-        <w:numPr>
-          <w:ilvl w:val="0"/>
-          <w:numId w:val="1005"/>
-        </w:numPr>
-      </w:pPr>
-      <w:r>
-        <w:t xml:space="preserve">Reversed a multi-quarter decline in Google indexation, increasing indexed page count by 30%.</w:t>
-      </w:r>
-    </w:p>
-    <w:p>
-      <w:pPr>
-        <w:pStyle w:val="Compact"/>
-        <w:numPr>
-          <w:ilvl w:val="0"/>
-          <w:numId w:val="1005"/>
-        </w:numPr>
-      </w:pPr>
-      <w:r>
-        <w:t xml:space="preserve">Drove dozens of millions of SERP-indexed URLs from red LCP (Core Web Vitals failure) to zero, with monitoring automation to keep them green.</w:t>
-      </w:r>
-    </w:p>
-    <w:p>
-      <w:pPr>
-        <w:pStyle w:val="Compact"/>
-        <w:numPr>
-          <w:ilvl w:val="0"/>
-          <w:numId w:val="1005"/>
-        </w:numPr>
-      </w:pPr>
-      <w:r>
-        <w:t xml:space="preserve">Increased mobile revenue by 20% YoY by focusing on stability and adding new features.</w:t>
-      </w:r>
-    </w:p>
-    <w:p>
-      <w:pPr>
-        <w:pStyle w:val="Compact"/>
-        <w:numPr>
-          <w:ilvl w:val="0"/>
-          <w:numId w:val="1005"/>
-        </w:numPr>
-      </w:pPr>
-      <w:r>
-        <w:t xml:space="preserve">Lifted mobile app release cadence from every other week to several times per week, focused on SEO performance and mobile feature delivery.</w:t>
       </w:r>
     </w:p>
     <w:bookmarkEnd w:id="11"/>
@@ -572,7 +554,7 @@
         <w:pStyle w:val="Compact"/>
         <w:numPr>
           <w:ilvl w:val="0"/>
-          <w:numId w:val="1006"/>
+          <w:numId w:val="1005"/>
         </w:numPr>
       </w:pPr>
       <w:r>
@@ -584,7 +566,7 @@
         <w:pStyle w:val="Compact"/>
         <w:numPr>
           <w:ilvl w:val="0"/>
-          <w:numId w:val="1006"/>
+          <w:numId w:val="1005"/>
         </w:numPr>
       </w:pPr>
       <w:r>
@@ -596,7 +578,7 @@
         <w:pStyle w:val="Compact"/>
         <w:numPr>
           <w:ilvl w:val="0"/>
-          <w:numId w:val="1006"/>
+          <w:numId w:val="1005"/>
         </w:numPr>
       </w:pPr>
       <w:r>
@@ -608,7 +590,7 @@
         <w:pStyle w:val="Compact"/>
         <w:numPr>
           <w:ilvl w:val="0"/>
-          <w:numId w:val="1006"/>
+          <w:numId w:val="1005"/>
         </w:numPr>
       </w:pPr>
       <w:r>
@@ -620,7 +602,7 @@
         <w:pStyle w:val="Compact"/>
         <w:numPr>
           <w:ilvl w:val="0"/>
-          <w:numId w:val="1006"/>
+          <w:numId w:val="1005"/>
         </w:numPr>
       </w:pPr>
       <w:r>
@@ -644,7 +626,7 @@
         <w:pStyle w:val="Compact"/>
         <w:numPr>
           <w:ilvl w:val="0"/>
-          <w:numId w:val="1006"/>
+          <w:numId w:val="1005"/>
         </w:numPr>
       </w:pPr>
       <w:r>
@@ -694,7 +676,7 @@
         <w:pStyle w:val="Compact"/>
         <w:numPr>
           <w:ilvl w:val="0"/>
-          <w:numId w:val="1007"/>
+          <w:numId w:val="1006"/>
         </w:numPr>
       </w:pPr>
       <w:r>
@@ -734,7 +716,7 @@
         <w:pStyle w:val="Compact"/>
         <w:numPr>
           <w:ilvl w:val="0"/>
-          <w:numId w:val="1008"/>
+          <w:numId w:val="1007"/>
         </w:numPr>
       </w:pPr>
       <w:r>
@@ -746,7 +728,7 @@
         <w:pStyle w:val="Compact"/>
         <w:numPr>
           <w:ilvl w:val="0"/>
-          <w:numId w:val="1008"/>
+          <w:numId w:val="1007"/>
         </w:numPr>
       </w:pPr>
       <w:r>
@@ -776,7 +758,7 @@
         <w:pStyle w:val="Compact"/>
         <w:numPr>
           <w:ilvl w:val="0"/>
-          <w:numId w:val="1009"/>
+          <w:numId w:val="1008"/>
         </w:numPr>
       </w:pPr>
       <w:r>
@@ -788,7 +770,7 @@
         <w:pStyle w:val="Compact"/>
         <w:numPr>
           <w:ilvl w:val="0"/>
-          <w:numId w:val="1009"/>
+          <w:numId w:val="1008"/>
         </w:numPr>
       </w:pPr>
       <w:r>
@@ -800,7 +782,7 @@
         <w:pStyle w:val="Compact"/>
         <w:numPr>
           <w:ilvl w:val="0"/>
-          <w:numId w:val="1009"/>
+          <w:numId w:val="1008"/>
         </w:numPr>
       </w:pPr>
       <w:r>
@@ -812,7 +794,7 @@
         <w:pStyle w:val="Compact"/>
         <w:numPr>
           <w:ilvl w:val="0"/>
-          <w:numId w:val="1009"/>
+          <w:numId w:val="1008"/>
         </w:numPr>
       </w:pPr>
       <w:r>
@@ -824,7 +806,7 @@
         <w:pStyle w:val="Compact"/>
         <w:numPr>
           <w:ilvl w:val="0"/>
-          <w:numId w:val="1009"/>
+          <w:numId w:val="1008"/>
         </w:numPr>
       </w:pPr>
       <w:r>
@@ -864,7 +846,7 @@
         <w:pStyle w:val="Compact"/>
         <w:numPr>
           <w:ilvl w:val="0"/>
-          <w:numId w:val="1010"/>
+          <w:numId w:val="1009"/>
         </w:numPr>
       </w:pPr>
       <w:r>
@@ -886,21 +868,39 @@
         <w:pStyle w:val="FirstParagraph"/>
       </w:pPr>
       <w:r>
-        <w:t xml:space="preserve">Leadership roles spanning engineering, operations, sales and marketing, and general business management at manufacturing and industrial automation companies. Co-inventor on US patent 7,610,734 for siding installation tools, plus two related fiber-cement cutting applications, developed through 3D CAD, CNC prototyping, and 3D printing.</w:t>
+        <w:t xml:space="preserve">Leadership roles spanning engineering, operations, sales and marketing, and general business management at manufacturing and industrial automation companies.</w:t>
       </w:r>
     </w:p>
     <w:bookmarkEnd w:id="15"/>
     <w:bookmarkEnd w:id="16"/>
-    <w:bookmarkStart w:id="18" w:name="education"/>
+    <w:bookmarkStart w:id="17" w:name="innovations"/>
     <w:p>
       <w:pPr>
         <w:pStyle w:val="Heading2"/>
       </w:pPr>
       <w:r>
+        <w:t xml:space="preserve">Innovations</w:t>
+      </w:r>
+    </w:p>
+    <w:p>
+      <w:pPr>
+        <w:pStyle w:val="FirstParagraph"/>
+      </w:pPr>
+      <w:r>
+        <w:t xml:space="preserve">Co-inventor on US patent 7,610,734 for siding installation tools, plus two related fiber-cement cutting applications, developed through 3D CAD, CNC prototyping, and 3D printing.</w:t>
+      </w:r>
+    </w:p>
+    <w:bookmarkEnd w:id="17"/>
+    <w:bookmarkStart w:id="19" w:name="education"/>
+    <w:p>
+      <w:pPr>
+        <w:pStyle w:val="Heading2"/>
+      </w:pPr>
+      <w:r>
         <w:t xml:space="preserve">Education</w:t>
       </w:r>
     </w:p>
-    <w:bookmarkStart w:id="17" w:name="olympic-college"/>
+    <w:bookmarkStart w:id="18" w:name="olympic-college"/>
     <w:p>
       <w:pPr>
         <w:pStyle w:val="Heading3"/>
@@ -917,9 +917,9 @@
         <w:t xml:space="preserve">Associates Degree (A.A.S.), General Studies — 3.75 GPA / Phi Theta Kappa</w:t>
       </w:r>
     </w:p>
-    <w:bookmarkEnd w:id="17"/>
     <w:bookmarkEnd w:id="18"/>
     <w:bookmarkEnd w:id="19"/>
+    <w:bookmarkEnd w:id="20"/>
     <w:sectPr>
       <w:footnotePr>
         <w:numRestart w:val="eachSect"/>
@@ -1273,9 +1273,6 @@
     <w:abstractNumId w:val="991"/>
   </w:num>
   <w:num w:numId="1009">
-    <w:abstractNumId w:val="991"/>
-  </w:num>
-  <w:num w:numId="1010">
     <w:abstractNumId w:val="991"/>
   </w:num>
 </w:numbering>

</xml_diff>

<commit_message>
docs(resume): tighten summary, trim bullets, consolidate UpTop
</commit_message>
<xml_diff>
--- a/tools/resume/resume.docx
+++ b/tools/resume/resume.docx
@@ -2,13 +2,13 @@
 <file path=word/document.xml><?xml version="1.0" encoding="utf-8"?>
 <w:document xmlns:w="http://schemas.openxmlformats.org/wordprocessingml/2006/main" xmlns:m="http://schemas.openxmlformats.org/officeDocument/2006/math" xmlns:r="http://schemas.openxmlformats.org/officeDocument/2006/relationships" xmlns:o="urn:schemas-microsoft-com:office:office" xmlns:v="urn:schemas-microsoft-com:vml" xmlns:w10="urn:schemas-microsoft-com:office:word" xmlns:a="http://schemas.openxmlformats.org/drawingml/2006/main" xmlns:pic="http://schemas.openxmlformats.org/drawingml/2006/picture" xmlns:wp="http://schemas.openxmlformats.org/drawingml/2006/wordprocessingDrawing">
   <w:body>
-    <w:bookmarkStart w:id="20" w:name="jon-edwards"/>
+    <w:bookmarkStart w:id="20" w:name="jonathan-jon-kolohe-edwards"/>
     <w:p>
       <w:pPr>
         <w:pStyle w:val="Heading1"/>
       </w:pPr>
       <w:r>
-        <w:t xml:space="preserve">Jon Edwards</w:t>
+        <w:t xml:space="preserve">Jonathan (Jon) Kolohe Edwards</w:t>
       </w:r>
     </w:p>
     <w:p>
@@ -25,18 +25,6 @@
     </w:p>
     <w:p>
       <w:pPr>
-        <w:pStyle w:val="BodyText"/>
-      </w:pPr>
-      <w:r>
-        <w:rPr>
-          <w:i/>
-          <w:iCs/>
-        </w:rPr>
-        <w:t xml:space="preserve">Product Engineering · Data Platforms · AI · Scaling Systems · Team Leadership</w:t>
-      </w:r>
-    </w:p>
-    <w:p>
-      <w:pPr>
         <w:pStyle w:val="Compact"/>
         <w:numPr>
           <w:ilvl w:val="0"/>
@@ -61,7 +49,7 @@
         <w:pStyle w:val="FirstParagraph"/>
       </w:pPr>
       <w:r>
-        <w:t xml:space="preserve">Principal Software Engineer building streaming data platforms over datasets in the hundreds of millions of records, modernizing developer platforms with Nix and monorepo tooling, and operationalizing AI-assisted engineering practice. In the past year, shipped a Flow-Based Programming data graph (~2.5M events/day and growing), avmbench — a property and people delivery platform that unlocked $1M in net new revenue and new categories of products — and Scala load shedding for a high-traffic search layer. 10+ years bridging deep IC and engineering leadership; has managed teams of up to 12.</w:t>
+        <w:t xml:space="preserve">Business-minded software-engineering leader building streaming data platforms over datasets in the hundreds of millions of records, modernizing developer platforms with Nix and monorepo tooling, and operationalizing AI-assisted engineering practice. In the past year, shipped a Flow-Based Programming data graph (~2.5M events/day and growing), avmbench — a property and people delivery platform that unlocked $1M in net new revenue and new categories of products — and Scala load shedding for a high-traffic search layer. 11+ years bridging deep IC and engineering leadership; has managed teams of up to 12 ICs.</w:t>
       </w:r>
     </w:p>
     <w:bookmarkEnd w:id="9"/>
@@ -72,6 +60,28 @@
       </w:pPr>
       <w:r>
         <w:t xml:space="preserve">Skills</w:t>
+      </w:r>
+    </w:p>
+    <w:p>
+      <w:pPr>
+        <w:pStyle w:val="Compact"/>
+        <w:numPr>
+          <w:ilvl w:val="0"/>
+          <w:numId w:val="1002"/>
+        </w:numPr>
+      </w:pPr>
+      <w:r>
+        <w:rPr>
+          <w:b/>
+          <w:bCs/>
+        </w:rPr>
+        <w:t xml:space="preserve">Leadership:</w:t>
+      </w:r>
+      <w:r>
+        <w:t xml:space="preserve"> </w:t>
+      </w:r>
+      <w:r>
+        <w:t xml:space="preserve">team management, mentorship, high-volume substantive code review, engineering governance, growth mindset</w:t>
       </w:r>
     </w:p>
     <w:p>
@@ -93,29 +103,7 @@
         <w:t xml:space="preserve"> </w:t>
       </w:r>
       <w:r>
-        <w:t xml:space="preserve">streaming data platforms, developer-platform modernization, AI-assisted engineering practice, Flow-Based Programming, distributed data pipelines</w:t>
-      </w:r>
-    </w:p>
-    <w:p>
-      <w:pPr>
-        <w:pStyle w:val="Compact"/>
-        <w:numPr>
-          <w:ilvl w:val="0"/>
-          <w:numId w:val="1002"/>
-        </w:numPr>
-      </w:pPr>
-      <w:r>
-        <w:rPr>
-          <w:b/>
-          <w:bCs/>
-        </w:rPr>
-        <w:t xml:space="preserve">Leadership:</w:t>
-      </w:r>
-      <w:r>
-        <w:t xml:space="preserve"> </w:t>
-      </w:r>
-      <w:r>
-        <w:t xml:space="preserve">team management, mentorship, high-volume substantive code review, engineering governance</w:t>
+        <w:t xml:space="preserve">end-to-end product engineering, streaming data platforms, developer-platform modernization, AI-assisted engineering practice, Flow-Based Programming, distributed data pipelines</w:t>
       </w:r>
     </w:p>
     <w:p>
@@ -137,7 +125,7 @@
         <w:t xml:space="preserve"> </w:t>
       </w:r>
       <w:r>
-        <w:t xml:space="preserve">Python, TypeScript, JavaScript, CUE, Bash; working knowledge of Rust, Scala 2, Java, C#, Kotlin, Swift</w:t>
+        <w:t xml:space="preserve">Python, TypeScript/JavaScript, CUE; working knowledge of Rust, Scala 2, Java, C#, Kotlin, Swift</w:t>
       </w:r>
     </w:p>
     <w:p>
@@ -159,7 +147,7 @@
         <w:t xml:space="preserve"> </w:t>
       </w:r>
       <w:r>
-        <w:t xml:space="preserve">AWS, Kubernetes, Helm, Terraform, Azure</w:t>
+        <w:t xml:space="preserve">AWS, Kubernetes, Helm, Terraform, Azure, Cloudflare</w:t>
       </w:r>
     </w:p>
     <w:p>
@@ -181,7 +169,7 @@
         <w:t xml:space="preserve"> </w:t>
       </w:r>
       <w:r>
-        <w:t xml:space="preserve">Nix, Docker, monorepos, CI/CD pipelines (GitHub Actions, Jenkins)</w:t>
+        <w:t xml:space="preserve">Nix, Kubernetes, Helm, Docker, monorepos, CI/CD pipelines (GitHub Actions, Jenkins)</w:t>
       </w:r>
     </w:p>
     <w:p>
@@ -203,7 +191,29 @@
         <w:t xml:space="preserve"> </w:t>
       </w:r>
       <w:r>
-        <w:t xml:space="preserve">Databricks, Delta Lake, Parquet, PostgreSQL, Redis, Elasticsearch, MCP, Claude API</w:t>
+        <w:t xml:space="preserve">Databricks, Delta Lake, Parquet, PostgreSQL, MS SQL, Redis, Elasticsearch, MCP, Claude, ChatGPT, OpenRouter</w:t>
+      </w:r>
+    </w:p>
+    <w:p>
+      <w:pPr>
+        <w:pStyle w:val="Compact"/>
+        <w:numPr>
+          <w:ilvl w:val="0"/>
+          <w:numId w:val="1002"/>
+        </w:numPr>
+      </w:pPr>
+      <w:r>
+        <w:rPr>
+          <w:b/>
+          <w:bCs/>
+        </w:rPr>
+        <w:t xml:space="preserve">Data Streaming:</w:t>
+      </w:r>
+      <w:r>
+        <w:t xml:space="preserve"> </w:t>
+      </w:r>
+      <w:r>
+        <w:t xml:space="preserve">NATS, Pulsar, AWS SQS, Kinesis, MQTT, Azure Event Hub</w:t>
       </w:r>
     </w:p>
     <w:p>
@@ -225,7 +235,7 @@
         <w:t xml:space="preserve"> </w:t>
       </w:r>
       <w:r>
-        <w:t xml:space="preserve">React, Vue, React Native, Angular 2+, Cordova</w:t>
+        <w:t xml:space="preserve">React, Vue, React Native, Angular 2+, Cordova, native iOS and Android, Alexa, PowerBI</w:t>
       </w:r>
     </w:p>
     <w:bookmarkEnd w:id="10"/>
@@ -250,18 +260,6 @@
     <w:p>
       <w:pPr>
         <w:pStyle w:val="FirstParagraph"/>
-      </w:pPr>
-      <w:r>
-        <w:rPr>
-          <w:i/>
-          <w:iCs/>
-        </w:rPr>
-        <w:t xml:space="preserve">(consumer search platform: 1B+ indexed pages, 10M+ unique users/month)</w:t>
-      </w:r>
-    </w:p>
-    <w:p>
-      <w:pPr>
-        <w:pStyle w:val="BodyText"/>
       </w:pPr>
       <w:r>
         <w:rPr>
@@ -286,7 +284,7 @@
         </w:numPr>
       </w:pPr>
       <w:r>
-        <w:t xml:space="preserve">Architected and productionized a data graph streaming platform grounded in J. Paul Morrison’s Flow-Based Programming, replacing parts of a multi-week, manually coordinated release process with on-demand delivery; currently handles ~2.5M events/day across two tenants in active onboarding.</w:t>
+        <w:t xml:space="preserve">Combined hands-on mentorship and operationalized agentic AI with a robust spec process to lift delivered work 2.5–4x year-over-year — CRO tickets, bug fixes, feature requests, and new tooling — leaving the team running ahead of business demand with real operational headroom, despite shrinking headcount.</w:t>
       </w:r>
     </w:p>
     <w:p>
@@ -298,7 +296,7 @@
         </w:numPr>
       </w:pPr>
       <w:r>
-        <w:t xml:space="preserve">Backing datasets cover ~355M people, ~436M phones, ~483M emails, and ~234M addresses; the platform also powers a real-time pipeline streaming scraped public-records data to subscriber webhooks.</w:t>
+        <w:t xml:space="preserve">Architected and productionized a data graph streaming platform grounded in Flow-Based Programming, replacing parts of a multi-week, manually coordinated release process with on-demand delivery; currently handles ~2.5M events/day across two tenants and is in active onboarding.</w:t>
       </w:r>
     </w:p>
     <w:p>
@@ -322,7 +320,7 @@
         </w:numPr>
       </w:pPr>
       <w:r>
-        <w:t xml:space="preserve">Built avmbench, a Property and People data delivery platform that unlocked a $1M net new revenue source — covering ~125M properties across all 50 states with a 17.1% national median error rate on valuation estimates, built on a custom geographic aggregation DSL and Census TIGER pipelines.</w:t>
+        <w:t xml:space="preserve">Built a Property and People (PnP) data delivery platform that unlocked a $1M net new revenue source — covering ~125M properties across all 50 states with a 17.1% national median error rate on valuation estimates, built on a custom geographic aggregation DSL and Census TIGER pipelines.</w:t>
       </w:r>
     </w:p>
     <w:p>
@@ -334,7 +332,7 @@
         </w:numPr>
       </w:pPr>
       <w:r>
-        <w:t xml:space="preserve">Designed and shipped P95-latency-based load shedding for the search layer in Scala — ring-buffer windowed computation, OPEN/TRIPPED state machine with hysteresis, 429-with-Retry-After rejection — wrapping all 18 route handlers.</w:t>
+        <w:t xml:space="preserve">Drove monorepo migration with shared tooling, standardized linting, Nix-based developer environments (wp-home-manager), and an internal developer-productivity CLI (pagecraft, PR review workflow with parallelized GitHub fetches and Nix/darwin tooling) — supporting ~100 service releases per week and shifting CVE scanning from infrequent reactive SRE scans to proactive CI gates.</w:t>
       </w:r>
     </w:p>
     <w:p>
@@ -346,7 +344,7 @@
         </w:numPr>
       </w:pPr>
       <w:r>
-        <w:t xml:space="preserve">Led migration of 2.5M events/day from Amplitude to Databricks Delta tables, eliminating several thousand dollars per month in overage fees while preserving the Salesforce/Kinesis ingest path.</w:t>
+        <w:t xml:space="preserve">Built MCP integration and AI inference harness on the engineering platform; authored org-wide documentation to set AI-assisted engineering practice.</w:t>
       </w:r>
     </w:p>
     <w:p>
@@ -358,65 +356,7 @@
         </w:numPr>
       </w:pPr>
       <w:r>
-        <w:t xml:space="preserve">Drove monorepo migration with shared tooling, standardized linting, Nix-based developer environments (wp-home-manager), and an internal developer-productivity CLI (pagecraft, PR review workflow with parallelized GitHub fetches and Nix/darwin tooling) — supporting ~100 service releases per week and shifting CVE scanning from infrequent reactive SRE scans to proactive CI gates.</w:t>
-      </w:r>
-    </w:p>
-    <w:p>
-      <w:pPr>
-        <w:pStyle w:val="Compact"/>
-        <w:numPr>
-          <w:ilvl w:val="0"/>
-          <w:numId w:val="1003"/>
-        </w:numPr>
-      </w:pPr>
-      <w:r>
-        <w:t xml:space="preserve">Built MCP integration and AI inference harness on the engineering platform; authored org-wide documentation to set AI-assisted engineering practice.</w:t>
-      </w:r>
-    </w:p>
-    <w:p>
-      <w:pPr>
-        <w:pStyle w:val="Compact"/>
-        <w:numPr>
-          <w:ilvl w:val="0"/>
-          <w:numId w:val="1003"/>
-        </w:numPr>
-      </w:pPr>
-      <w:r>
-        <w:t xml:space="preserve">Combined hands-on mentorship and operationalized agentic AI with a robust spec process to lift delivered work 2.5–4x year-over-year — CRO tickets, bug fixes, feature requests, and new tooling — leaving the team running ahead of business demand with real operational headroom, despite shrinking headcount.</w:t>
-      </w:r>
-    </w:p>
-    <w:p>
-      <w:pPr>
-        <w:pStyle w:val="Compact"/>
-        <w:numPr>
-          <w:ilvl w:val="0"/>
-          <w:numId w:val="1003"/>
-        </w:numPr>
-      </w:pPr>
-      <w:r>
         <w:t xml:space="preserve">Sustained high-volume, substantive peer code review across the platform org — 261 reviews in the first 15 weeks of 2026 alone (~75/month, mean 6 / median 4 comments per PR, ~1,000-line PR average) — reinforcing engineering standards and a small-PR discipline.</w:t>
-      </w:r>
-    </w:p>
-    <w:p>
-      <w:pPr>
-        <w:pStyle w:val="Compact"/>
-        <w:numPr>
-          <w:ilvl w:val="0"/>
-          <w:numId w:val="1003"/>
-        </w:numPr>
-      </w:pPr>
-      <w:r>
-        <w:rPr>
-          <w:i/>
-          <w:iCs/>
-        </w:rPr>
-        <w:t xml:space="preserve">Technology used:</w:t>
-      </w:r>
-      <w:r>
-        <w:t xml:space="preserve"> </w:t>
-      </w:r>
-      <w:r>
-        <w:t xml:space="preserve">Python, Rust, Scala, CUE, Nix, Kubernetes, Helm, Databricks, Delta Lake, MCP.</w:t>
       </w:r>
     </w:p>
     <w:p>
@@ -446,7 +386,7 @@
         </w:numPr>
       </w:pPr>
       <w:r>
-        <w:t xml:space="preserve">Reversed a multi-quarter decline in Google indexation, increasing indexed page count by 30%.</w:t>
+        <w:t xml:space="preserve">Reversed a multi-quarter decline in Google indexation and increased indexed page count by more than 30%.</w:t>
       </w:r>
     </w:p>
     <w:p>
@@ -470,19 +410,7 @@
         </w:numPr>
       </w:pPr>
       <w:r>
-        <w:t xml:space="preserve">Increased mobile revenue by 20% YoY by focusing on stability and adding new features.</w:t>
-      </w:r>
-    </w:p>
-    <w:p>
-      <w:pPr>
-        <w:pStyle w:val="Compact"/>
-        <w:numPr>
-          <w:ilvl w:val="0"/>
-          <w:numId w:val="1004"/>
-        </w:numPr>
-      </w:pPr>
-      <w:r>
-        <w:t xml:space="preserve">Lifted mobile app release cadence from every other week to several times per week, focused on SEO performance and mobile feature delivery.</w:t>
+        <w:t xml:space="preserve">Increased mobile revenue by 20% YoY by focusing on stability and adding new features. Increased release cadence from every other week to several times per week.</w:t>
       </w:r>
     </w:p>
     <w:p>
@@ -522,18 +450,6 @@
     <w:p>
       <w:pPr>
         <w:pStyle w:val="FirstParagraph"/>
-      </w:pPr>
-      <w:r>
-        <w:rPr>
-          <w:i/>
-          <w:iCs/>
-        </w:rPr>
-        <w:t xml:space="preserve">(contractor through Bluehawk Consulting, converted to FTE in Jan 2020)</w:t>
-      </w:r>
-    </w:p>
-    <w:p>
-      <w:pPr>
-        <w:pStyle w:val="BodyText"/>
       </w:pPr>
       <w:r>
         <w:rPr>
@@ -570,7 +486,7 @@
         </w:numPr>
       </w:pPr>
       <w:r>
-        <w:t xml:space="preserve">Worked with a team of three for four months to replace a fragile monolithic platform including a portal with a new microservice-based platform, saving $120k a year while improving availability and maintainability.</w:t>
+        <w:t xml:space="preserve">Worked with a team of three for four months to replace a fragile platform that included a portal with a new microservice-based platform, saving $120k a year while improving availability, extensibility, and maintainability.</w:t>
       </w:r>
     </w:p>
     <w:p>
@@ -595,52 +511,6 @@
       </w:pPr>
       <w:r>
         <w:t xml:space="preserve">Built tooling and test frameworks for code quality (type-checking, linting, unit testing) and regression/UX testing (Storybook, screenshot diffing, Detox E2E).</w:t>
-      </w:r>
-    </w:p>
-    <w:p>
-      <w:pPr>
-        <w:pStyle w:val="Compact"/>
-        <w:numPr>
-          <w:ilvl w:val="0"/>
-          <w:numId w:val="1005"/>
-        </w:numPr>
-      </w:pPr>
-      <w:r>
-        <w:t xml:space="preserve">Architected an end-to-end</w:t>
-      </w:r>
-      <w:r>
-        <w:t xml:space="preserve"> </w:t>
-      </w:r>
-      <w:r>
-        <w:t xml:space="preserve">“checklist service”</w:t>
-      </w:r>
-      <w:r>
-        <w:t xml:space="preserve"> </w:t>
-      </w:r>
-      <w:r>
-        <w:t xml:space="preserve">as a fully tested Micronaut microservice with CRUD support and a performance-optimized client API.</w:t>
-      </w:r>
-    </w:p>
-    <w:p>
-      <w:pPr>
-        <w:pStyle w:val="Compact"/>
-        <w:numPr>
-          <w:ilvl w:val="0"/>
-          <w:numId w:val="1005"/>
-        </w:numPr>
-      </w:pPr>
-      <w:r>
-        <w:rPr>
-          <w:i/>
-          <w:iCs/>
-        </w:rPr>
-        <w:t xml:space="preserve">Technology used:</w:t>
-      </w:r>
-      <w:r>
-        <w:t xml:space="preserve"> </w:t>
-      </w:r>
-      <w:r>
-        <w:t xml:space="preserve">React Native, TypeScript, Java, Swift, Kotlin, Micronaut, PostgreSQL, Azure (AKS, DevOps), MQTT, HomeKit.</w:t>
       </w:r>
     </w:p>
     <w:bookmarkEnd w:id="12"/>
@@ -702,13 +572,13 @@
           <w:b/>
           <w:bCs/>
         </w:rPr>
-        <w:t xml:space="preserve">Product Development Manager</w:t>
+        <w:t xml:space="preserve">Development Team Lead</w:t>
       </w:r>
       <w:r>
         <w:t xml:space="preserve"> </w:t>
       </w:r>
       <w:r>
-        <w:t xml:space="preserve">— Jun 2018 – Nov 2018</w:t>
+        <w:t xml:space="preserve">— Apr 2016 – Nov 2018</w:t>
       </w:r>
     </w:p>
     <w:p>
@@ -732,7 +602,53 @@
         </w:numPr>
       </w:pPr>
       <w:r>
-        <w:t xml:space="preserve">Laid the groundwork for a platform for the cleaning industry by building a two-person product-focused team.</w:t>
+        <w:t xml:space="preserve">Contributed as IC at 120% billable utilization while building a full-stack development team that grew to 12.</w:t>
+      </w:r>
+    </w:p>
+    <w:p>
+      <w:pPr>
+        <w:pStyle w:val="Compact"/>
+        <w:numPr>
+          <w:ilvl w:val="0"/>
+          <w:numId w:val="1007"/>
+        </w:numPr>
+      </w:pPr>
+      <w:r>
+        <w:t xml:space="preserve">Successfully delivered 13 web and hybrid mobile application projects for clients including Microsoft, Premera, Capital One, Belkin, and Entertainment Partners.</w:t>
+      </w:r>
+    </w:p>
+    <w:p>
+      <w:pPr>
+        <w:pStyle w:val="Compact"/>
+        <w:numPr>
+          <w:ilvl w:val="0"/>
+          <w:numId w:val="1007"/>
+        </w:numPr>
+      </w:pPr>
+      <w:r>
+        <w:t xml:space="preserve">Led architecture shift from server-rendered ASP.NET MVC to Web API + Angular on Microsoft’s Cloud Launchpad portal, decoupling frontend and backend concerns.</w:t>
+      </w:r>
+    </w:p>
+    <w:p>
+      <w:pPr>
+        <w:pStyle w:val="Compact"/>
+        <w:numPr>
+          <w:ilvl w:val="0"/>
+          <w:numId w:val="1007"/>
+        </w:numPr>
+      </w:pPr>
+      <w:r>
+        <w:t xml:space="preserve">Served as lead mobile developer for the Belkin Linksys consumer app, with the team delivering on schedule for the CES launch window.</w:t>
+      </w:r>
+    </w:p>
+    <w:bookmarkEnd w:id="14"/>
+    <w:bookmarkStart w:id="15" w:name="earlier-career-1997-2016"/>
+    <w:p>
+      <w:pPr>
+        <w:pStyle w:val="Heading3"/>
+      </w:pPr>
+      <w:r>
+        <w:t xml:space="preserve">Earlier Career (1997 – 2016)</w:t>
       </w:r>
     </w:p>
     <w:p>
@@ -740,135 +656,7 @@
         <w:pStyle w:val="FirstParagraph"/>
       </w:pPr>
       <w:r>
-        <w:rPr>
-          <w:b/>
-          <w:bCs/>
-        </w:rPr>
-        <w:t xml:space="preserve">Development Team Lead</w:t>
-      </w:r>
-      <w:r>
-        <w:t xml:space="preserve"> </w:t>
-      </w:r>
-      <w:r>
-        <w:t xml:space="preserve">— Apr 2016 – Jun 2018</w:t>
-      </w:r>
-    </w:p>
-    <w:p>
-      <w:pPr>
-        <w:pStyle w:val="Compact"/>
-        <w:numPr>
-          <w:ilvl w:val="0"/>
-          <w:numId w:val="1008"/>
-        </w:numPr>
-      </w:pPr>
-      <w:r>
-        <w:t xml:space="preserve">Contributed as IC at 120% billable utilization while building a full-stack development team that grew to 12.</w:t>
-      </w:r>
-    </w:p>
-    <w:p>
-      <w:pPr>
-        <w:pStyle w:val="Compact"/>
-        <w:numPr>
-          <w:ilvl w:val="0"/>
-          <w:numId w:val="1008"/>
-        </w:numPr>
-      </w:pPr>
-      <w:r>
-        <w:t xml:space="preserve">Successfully delivered 13 web and hybrid mobile application projects for clients including Microsoft, Premera, Capital One, Belkin, and Entertainment Partners.</w:t>
-      </w:r>
-    </w:p>
-    <w:p>
-      <w:pPr>
-        <w:pStyle w:val="Compact"/>
-        <w:numPr>
-          <w:ilvl w:val="0"/>
-          <w:numId w:val="1008"/>
-        </w:numPr>
-      </w:pPr>
-      <w:r>
-        <w:t xml:space="preserve">Led architecture shift from server-rendered ASP.NET MVC to Web API + Angular on Microsoft’s Cloud Launchpad portal, decoupling frontend and backend concerns.</w:t>
-      </w:r>
-    </w:p>
-    <w:p>
-      <w:pPr>
-        <w:pStyle w:val="Compact"/>
-        <w:numPr>
-          <w:ilvl w:val="0"/>
-          <w:numId w:val="1008"/>
-        </w:numPr>
-      </w:pPr>
-      <w:r>
-        <w:t xml:space="preserve">Served as lead mobile developer on the Belkin Linksys consumer app, with the team delivering on schedule for the CES launch window.</w:t>
-      </w:r>
-    </w:p>
-    <w:p>
-      <w:pPr>
-        <w:pStyle w:val="Compact"/>
-        <w:numPr>
-          <w:ilvl w:val="0"/>
-          <w:numId w:val="1008"/>
-        </w:numPr>
-      </w:pPr>
-      <w:r>
-        <w:rPr>
-          <w:i/>
-          <w:iCs/>
-        </w:rPr>
-        <w:t xml:space="preserve">Technology used:</w:t>
-      </w:r>
-      <w:r>
-        <w:t xml:space="preserve"> </w:t>
-      </w:r>
-      <w:r>
-        <w:t xml:space="preserve">ASP.NET Core, C#, Node, MS SQL, Azure, AWS, React, Angular 2+, PHP, WordPress, Elasticsearch.</w:t>
-      </w:r>
-    </w:p>
-    <w:p>
-      <w:pPr>
-        <w:pStyle w:val="FirstParagraph"/>
-      </w:pPr>
-      <w:r>
-        <w:rPr>
-          <w:b/>
-          <w:bCs/>
-        </w:rPr>
-        <w:t xml:space="preserve">Software Developer</w:t>
-      </w:r>
-      <w:r>
-        <w:t xml:space="preserve"> </w:t>
-      </w:r>
-      <w:r>
-        <w:t xml:space="preserve">— Jul 2015 – Apr 2016</w:t>
-      </w:r>
-    </w:p>
-    <w:p>
-      <w:pPr>
-        <w:pStyle w:val="Compact"/>
-        <w:numPr>
-          <w:ilvl w:val="0"/>
-          <w:numId w:val="1009"/>
-        </w:numPr>
-      </w:pPr>
-      <w:r>
-        <w:t xml:space="preserve">Finished three client projects (each estimated between 4 and 6 months) early and under budget.</w:t>
-      </w:r>
-    </w:p>
-    <w:bookmarkEnd w:id="14"/>
-    <w:bookmarkStart w:id="15" w:name="earlier-career-19972015"/>
-    <w:p>
-      <w:pPr>
-        <w:pStyle w:val="Heading3"/>
-      </w:pPr>
-      <w:r>
-        <w:t xml:space="preserve">Earlier Career (1997–2015)</w:t>
-      </w:r>
-    </w:p>
-    <w:p>
-      <w:pPr>
-        <w:pStyle w:val="FirstParagraph"/>
-      </w:pPr>
-      <w:r>
-        <w:t xml:space="preserve">Leadership roles spanning engineering, operations, sales and marketing, and general business management at manufacturing and industrial automation companies.</w:t>
+        <w:t xml:space="preserve">Leadership roles spanning engineering, operations, sales and marketing, and general business management at manufacturing and industrial automation companies. Immediately after transitioning from manufacturing to software engineering, I joined an agency (UpTop) and finished three client projects early and under budget.</w:t>
       </w:r>
     </w:p>
     <w:bookmarkEnd w:id="15"/>
@@ -1268,12 +1056,6 @@
     <w:abstractNumId w:val="991"/>
   </w:num>
   <w:num w:numId="1007">
-    <w:abstractNumId w:val="991"/>
-  </w:num>
-  <w:num w:numId="1008">
-    <w:abstractNumId w:val="991"/>
-  </w:num>
-  <w:num w:numId="1009">
     <w:abstractNumId w:val="991"/>
   </w:num>
 </w:numbering>

</xml_diff>

<commit_message>
docs(resume): apply Claude Desktop feedback pass
</commit_message>
<xml_diff>
--- a/tools/resume/resume.docx
+++ b/tools/resume/resume.docx
@@ -2,7 +2,7 @@
 <file path=word/document.xml><?xml version="1.0" encoding="utf-8"?>
 <w:document xmlns:w="http://schemas.openxmlformats.org/wordprocessingml/2006/main" xmlns:m="http://schemas.openxmlformats.org/officeDocument/2006/math" xmlns:r="http://schemas.openxmlformats.org/officeDocument/2006/relationships" xmlns:o="urn:schemas-microsoft-com:office:office" xmlns:v="urn:schemas-microsoft-com:vml" xmlns:w10="urn:schemas-microsoft-com:office:word" xmlns:a="http://schemas.openxmlformats.org/drawingml/2006/main" xmlns:pic="http://schemas.openxmlformats.org/drawingml/2006/picture" xmlns:wp="http://schemas.openxmlformats.org/drawingml/2006/wordprocessingDrawing">
   <w:body>
-    <w:bookmarkStart w:id="20" w:name="jonathan-jon-kolohe-edwards"/>
+    <w:bookmarkStart w:id="22" w:name="jonathan-jon-kolohe-edwards"/>
     <w:p>
       <w:pPr>
         <w:pStyle w:val="Heading1"/>
@@ -32,10 +32,38 @@
         </w:numPr>
       </w:pPr>
       <w:r>
-        <w:t xml:space="preserve">509-8185 • jkedwards@me.com • US Person • Bainbridge Island, WA</w:t>
-      </w:r>
-    </w:p>
-    <w:bookmarkStart w:id="9" w:name="summary"/>
+        <w:t xml:space="preserve">509-8185 • jkedwards@me.com • US Person • Bainbridge Island, WA •</w:t>
+      </w:r>
+      <w:r>
+        <w:t xml:space="preserve"> </w:t>
+      </w:r>
+      <w:hyperlink r:id="rId9">
+        <w:r>
+          <w:rPr>
+            <w:rStyle w:val="Hyperlink"/>
+          </w:rPr>
+          <w:t xml:space="preserve">LinkedIn</w:t>
+        </w:r>
+      </w:hyperlink>
+      <w:r>
+        <w:t xml:space="preserve"> </w:t>
+      </w:r>
+      <w:r>
+        <w:t xml:space="preserve">•</w:t>
+      </w:r>
+      <w:r>
+        <w:t xml:space="preserve"> </w:t>
+      </w:r>
+      <w:hyperlink r:id="rId10">
+        <w:r>
+          <w:rPr>
+            <w:rStyle w:val="Hyperlink"/>
+          </w:rPr>
+          <w:t xml:space="preserve">GitHub</w:t>
+        </w:r>
+      </w:hyperlink>
+    </w:p>
+    <w:bookmarkStart w:id="11" w:name="summary"/>
     <w:p>
       <w:pPr>
         <w:pStyle w:val="Heading2"/>
@@ -49,11 +77,11 @@
         <w:pStyle w:val="FirstParagraph"/>
       </w:pPr>
       <w:r>
-        <w:t xml:space="preserve">Business-minded software-engineering leader building streaming data platforms over datasets in the hundreds of millions of records, modernizing developer platforms with Nix and monorepo tooling, and operationalizing AI-assisted engineering practice. In the past year, shipped a Flow-Based Programming data graph (~2.5M events/day and growing), avmbench — a property and people delivery platform that unlocked $1M in net new revenue and new categories of products — and Scala load shedding for a high-traffic search layer. 11+ years bridging deep IC and engineering leadership; has managed teams of up to 12 ICs.</w:t>
-      </w:r>
-    </w:p>
-    <w:bookmarkEnd w:id="9"/>
-    <w:bookmarkStart w:id="10" w:name="skills"/>
+        <w:t xml:space="preserve">Business-minded software-engineering leader practicing end-to-end product engineering on streaming data platforms over datasets in the hundreds of millions of records and modernizing developer platforms with Nix and monorepo tooling. In the past year, shipped a Flow-Based Programming data graph (~2.5M events/day and growing), a Property and People data delivery platform that unlocked $1M in net new revenue and new categories of products, and Scala load shedding for a high-traffic search layer. 11+ years bridging deep IC and engineering leadership; has managed teams of up to 12 ICs.</w:t>
+      </w:r>
+    </w:p>
+    <w:bookmarkEnd w:id="11"/>
+    <w:bookmarkStart w:id="12" w:name="skills"/>
     <w:p>
       <w:pPr>
         <w:pStyle w:val="Heading2"/>
@@ -81,29 +109,7 @@
         <w:t xml:space="preserve"> </w:t>
       </w:r>
       <w:r>
-        <w:t xml:space="preserve">team management, mentorship, high-volume substantive code review, engineering governance, growth mindset</w:t>
-      </w:r>
-    </w:p>
-    <w:p>
-      <w:pPr>
-        <w:pStyle w:val="Compact"/>
-        <w:numPr>
-          <w:ilvl w:val="0"/>
-          <w:numId w:val="1002"/>
-        </w:numPr>
-      </w:pPr>
-      <w:r>
-        <w:rPr>
-          <w:b/>
-          <w:bCs/>
-        </w:rPr>
-        <w:t xml:space="preserve">Specialties:</w:t>
-      </w:r>
-      <w:r>
-        <w:t xml:space="preserve"> </w:t>
-      </w:r>
-      <w:r>
-        <w:t xml:space="preserve">end-to-end product engineering, streaming data platforms, developer-platform modernization, AI-assisted engineering practice, Flow-Based Programming, distributed data pipelines</w:t>
+        <w:t xml:space="preserve">team management, mentorship, high-volume substantive code review, engineering governance</w:t>
       </w:r>
     </w:p>
     <w:p>
@@ -125,7 +131,7 @@
         <w:t xml:space="preserve"> </w:t>
       </w:r>
       <w:r>
-        <w:t xml:space="preserve">Python, TypeScript/JavaScript, CUE; working knowledge of Rust, Scala 2, Java, C#, Kotlin, Swift</w:t>
+        <w:t xml:space="preserve">Python, TypeScript/JavaScript, CUE, Rust, Scala 2; prior production: Java, C#, Kotlin, Swift</w:t>
       </w:r>
     </w:p>
     <w:p>
@@ -147,7 +153,7 @@
         <w:t xml:space="preserve"> </w:t>
       </w:r>
       <w:r>
-        <w:t xml:space="preserve">AWS, Kubernetes, Helm, Terraform, Azure, Cloudflare</w:t>
+        <w:t xml:space="preserve">AWS, Azure, Linode, Cloudflare, Terraform</w:t>
       </w:r>
     </w:p>
     <w:p>
@@ -191,7 +197,7 @@
         <w:t xml:space="preserve"> </w:t>
       </w:r>
       <w:r>
-        <w:t xml:space="preserve">Databricks, Delta Lake, Parquet, PostgreSQL, MS SQL, Redis, Elasticsearch, MCP, Claude, ChatGPT, OpenRouter</w:t>
+        <w:t xml:space="preserve">Databricks, Delta Lake, Parquet, PostgreSQL, MS SQL, Redis, Elasticsearch, MCP</w:t>
       </w:r>
     </w:p>
     <w:p>
@@ -235,11 +241,11 @@
         <w:t xml:space="preserve"> </w:t>
       </w:r>
       <w:r>
-        <w:t xml:space="preserve">React, Vue, React Native, Angular 2+, Cordova, native iOS and Android, Alexa, PowerBI</w:t>
-      </w:r>
-    </w:p>
-    <w:bookmarkEnd w:id="10"/>
-    <w:bookmarkStart w:id="16" w:name="work-experience"/>
+        <w:t xml:space="preserve">React, Vue, React Native, Angular 2+, Cordova, native iOS and Android</w:t>
+      </w:r>
+    </w:p>
+    <w:bookmarkEnd w:id="12"/>
+    <w:bookmarkStart w:id="18" w:name="work-experience"/>
     <w:p>
       <w:pPr>
         <w:pStyle w:val="Heading2"/>
@@ -248,7 +254,7 @@
         <w:t xml:space="preserve">Work Experience</w:t>
       </w:r>
     </w:p>
-    <w:bookmarkStart w:id="11" w:name="whitepages"/>
+    <w:bookmarkStart w:id="13" w:name="whitepages"/>
     <w:p>
       <w:pPr>
         <w:pStyle w:val="Heading3"/>
@@ -284,7 +290,7 @@
         </w:numPr>
       </w:pPr>
       <w:r>
-        <w:t xml:space="preserve">Combined hands-on mentorship and operationalized agentic AI with a robust spec process to lift delivered work 2.5–4x year-over-year — CRO tickets, bug fixes, feature requests, and new tooling — leaving the team running ahead of business demand with real operational headroom, despite shrinking headcount.</w:t>
+        <w:t xml:space="preserve">Tripled team commit throughput year-over-year (CRO tickets, bug fixes, feature requests, and new tooling) by pairing hands-on mentorship with operationalized agentic AI and a robust spec process, leaving the team running ahead of business demand despite shrinking headcount.</w:t>
       </w:r>
     </w:p>
     <w:p>
@@ -296,7 +302,7 @@
         </w:numPr>
       </w:pPr>
       <w:r>
-        <w:t xml:space="preserve">Architected and productionized a data graph streaming platform grounded in Flow-Based Programming, replacing parts of a multi-week, manually coordinated release process with on-demand delivery; currently handles ~2.5M events/day across two tenants and is in active onboarding.</w:t>
+        <w:t xml:space="preserve">Architected and productionized a Flow-Based Programming data graph streaming platform (function server, CUE-based pipeline compiler, metrics and logging, bulk ingestion/export), replacing parts of a multi-week, manually coordinated release process with on-demand delivery; currently handles ~2.5M events/day across two tenants and is in active onboarding.</w:t>
       </w:r>
     </w:p>
     <w:p>
@@ -308,7 +314,7 @@
         </w:numPr>
       </w:pPr>
       <w:r>
-        <w:t xml:space="preserve">Own architecture decisions, the function server, the pipeline compiler (built on a CUE-based DSL), metrics and logging, and bulk ingestion/export operations.</w:t>
+        <w:t xml:space="preserve">Built a Property and People (PnP) data delivery platform that unlocked a $1M net new revenue source, covering ~125M properties across all 50 states, built on a custom geographic aggregation DSL and Census TIGER pipelines.</w:t>
       </w:r>
     </w:p>
     <w:p>
@@ -320,7 +326,7 @@
         </w:numPr>
       </w:pPr>
       <w:r>
-        <w:t xml:space="preserve">Built a Property and People (PnP) data delivery platform that unlocked a $1M net new revenue source — covering ~125M properties across all 50 states with a 17.1% national median error rate on valuation estimates, built on a custom geographic aggregation DSL and Census TIGER pipelines.</w:t>
+        <w:t xml:space="preserve">Drove monorepo migration with shared tooling, standardized linting, Nix-based developer environments (wp-home-manager), and an internal developer-productivity CLI (pagecraft, PR review workflow with parallelized GitHub fetches and Nix/darwin tooling), supporting ~100 service releases per week and shifting CVE scanning from infrequent reactive SRE scans to proactive CI gates.</w:t>
       </w:r>
     </w:p>
     <w:p>
@@ -332,7 +338,7 @@
         </w:numPr>
       </w:pPr>
       <w:r>
-        <w:t xml:space="preserve">Drove monorepo migration with shared tooling, standardized linting, Nix-based developer environments (wp-home-manager), and an internal developer-productivity CLI (pagecraft, PR review workflow with parallelized GitHub fetches and Nix/darwin tooling) — supporting ~100 service releases per week and shifting CVE scanning from infrequent reactive SRE scans to proactive CI gates.</w:t>
+        <w:t xml:space="preserve">Built MCP integration and AI inference harness on the engineering platform; authored org-wide documentation to establish AI-assisted engineering practice.</w:t>
       </w:r>
     </w:p>
     <w:p>
@@ -344,19 +350,7 @@
         </w:numPr>
       </w:pPr>
       <w:r>
-        <w:t xml:space="preserve">Built MCP integration and AI inference harness on the engineering platform; authored org-wide documentation to set AI-assisted engineering practice.</w:t>
-      </w:r>
-    </w:p>
-    <w:p>
-      <w:pPr>
-        <w:pStyle w:val="Compact"/>
-        <w:numPr>
-          <w:ilvl w:val="0"/>
-          <w:numId w:val="1003"/>
-        </w:numPr>
-      </w:pPr>
-      <w:r>
-        <w:t xml:space="preserve">Sustained high-volume, substantive peer code review across the platform org — 261 reviews in the first 15 weeks of 2026 alone (~75/month, mean 6 / median 4 comments per PR, ~1,000-line PR average) — reinforcing engineering standards and a small-PR discipline.</w:t>
+        <w:t xml:space="preserve">Sustained high-volume, substantive peer code review across the platform org: 261 reviews in the first 15 weeks of 2026 alone (~75/month, mean 6 / median 4 comments per PR, ~1,000-line PR average), reinforcing engineering standards.</w:t>
       </w:r>
     </w:p>
     <w:p>
@@ -398,7 +392,7 @@
         </w:numPr>
       </w:pPr>
       <w:r>
-        <w:t xml:space="preserve">Drove dozens of millions of SERP-indexed URLs from red LCP (Core Web Vitals failure) to zero, with monitoring automation to keep them green.</w:t>
+        <w:t xml:space="preserve">Drove tens of millions of SERP-indexed URLs from red LCP (Core Web Vitals failure) to zero, with monitoring automation to keep them green.</w:t>
       </w:r>
     </w:p>
     <w:p>
@@ -410,7 +404,7 @@
         </w:numPr>
       </w:pPr>
       <w:r>
-        <w:t xml:space="preserve">Increased mobile revenue by 20% YoY by focusing on stability and adding new features. Increased release cadence from every other week to several times per week.</w:t>
+        <w:t xml:space="preserve">Increased mobile revenue by 20% YoY by reworking state management to cut the app’s crash rate. Lifted release cadence from twice a month to 2+ per week.</w:t>
       </w:r>
     </w:p>
     <w:p>
@@ -437,8 +431,8 @@
         <w:t xml:space="preserve">Returned to the IC track in Jun 2023 to focus on data platform architecture.</w:t>
       </w:r>
     </w:p>
-    <w:bookmarkEnd w:id="11"/>
-    <w:bookmarkStart w:id="12" w:name="lifx-buddy-technologies"/>
+    <w:bookmarkEnd w:id="13"/>
+    <w:bookmarkStart w:id="14" w:name="lifx-buddy-technologies"/>
     <w:p>
       <w:pPr>
         <w:pStyle w:val="Heading3"/>
@@ -486,7 +480,7 @@
         </w:numPr>
       </w:pPr>
       <w:r>
-        <w:t xml:space="preserve">Worked with a team of three for four months to replace a fragile platform that included a portal with a new microservice-based platform, saving $120k a year while improving availability, extensibility, and maintainability.</w:t>
+        <w:t xml:space="preserve">Worked with a team of three for four months to replace a fragile, unmaintainable platform (including a portal) with a microservice-based architecture, unblocking the feature roadmap, improving stability for end users, and cutting $120k/year in run cost.</w:t>
       </w:r>
     </w:p>
     <w:p>
@@ -513,8 +507,8 @@
         <w:t xml:space="preserve">Built tooling and test frameworks for code quality (type-checking, linting, unit testing) and regression/UX testing (Storybook, screenshot diffing, Detox E2E).</w:t>
       </w:r>
     </w:p>
-    <w:bookmarkEnd w:id="12"/>
-    <w:bookmarkStart w:id="13" w:name="belkin-international"/>
+    <w:bookmarkEnd w:id="14"/>
+    <w:bookmarkStart w:id="15" w:name="belkin-international"/>
     <w:p>
       <w:pPr>
         <w:pStyle w:val="Heading3"/>
@@ -553,8 +547,8 @@
         <w:t xml:space="preserve">Extended a Cordova mobile application, built React Native and Flutter proof-of-concept apps, and created a test automation framework.</w:t>
       </w:r>
     </w:p>
-    <w:bookmarkEnd w:id="13"/>
-    <w:bookmarkStart w:id="14" w:name="uptop"/>
+    <w:bookmarkEnd w:id="15"/>
+    <w:bookmarkStart w:id="16" w:name="uptop"/>
     <w:p>
       <w:pPr>
         <w:pStyle w:val="Heading3"/>
@@ -602,7 +596,7 @@
         </w:numPr>
       </w:pPr>
       <w:r>
-        <w:t xml:space="preserve">Contributed as IC at 120% billable utilization while building a full-stack development team that grew to 12.</w:t>
+        <w:t xml:space="preserve">Built a full-stack development team that grew to 12 while continuing as an IC on client work.</w:t>
       </w:r>
     </w:p>
     <w:p>
@@ -641,8 +635,8 @@
         <w:t xml:space="preserve">Served as lead mobile developer for the Belkin Linksys consumer app, with the team delivering on schedule for the CES launch window.</w:t>
       </w:r>
     </w:p>
-    <w:bookmarkEnd w:id="14"/>
-    <w:bookmarkStart w:id="15" w:name="earlier-career-1997-2016"/>
+    <w:bookmarkEnd w:id="16"/>
+    <w:bookmarkStart w:id="17" w:name="earlier-career-1997-2016"/>
     <w:p>
       <w:pPr>
         <w:pStyle w:val="Heading3"/>
@@ -656,12 +650,12 @@
         <w:pStyle w:val="FirstParagraph"/>
       </w:pPr>
       <w:r>
-        <w:t xml:space="preserve">Leadership roles spanning engineering, operations, sales and marketing, and general business management at manufacturing and industrial automation companies. Immediately after transitioning from manufacturing to software engineering, I joined an agency (UpTop) and finished three client projects early and under budget.</w:t>
-      </w:r>
-    </w:p>
-    <w:bookmarkEnd w:id="15"/>
-    <w:bookmarkEnd w:id="16"/>
-    <w:bookmarkStart w:id="17" w:name="innovations"/>
+        <w:t xml:space="preserve">Two decades of cross-functional leadership (engineering, operations, sales, GM) at manufacturing and industrial automation companies before transitioning to software at UpTop in 2016, delivering three client projects early and under budget as an entry-level software engineer.</w:t>
+      </w:r>
+    </w:p>
+    <w:bookmarkEnd w:id="17"/>
+    <w:bookmarkEnd w:id="18"/>
+    <w:bookmarkStart w:id="19" w:name="innovations"/>
     <w:p>
       <w:pPr>
         <w:pStyle w:val="Heading2"/>
@@ -675,11 +669,11 @@
         <w:pStyle w:val="FirstParagraph"/>
       </w:pPr>
       <w:r>
-        <w:t xml:space="preserve">Co-inventor on US patent 7,610,734 for siding installation tools, plus two related fiber-cement cutting applications, developed through 3D CAD, CNC prototyping, and 3D printing.</w:t>
-      </w:r>
-    </w:p>
-    <w:bookmarkEnd w:id="17"/>
-    <w:bookmarkStart w:id="19" w:name="education"/>
+        <w:t xml:space="preserve">Inventor / builder habit, outside software: co-inventor on US patent 7,610,734 for siding installation tools, plus two related fiber-cement cutting applications, developed through 3D CAD, CNC prototyping, and 3D printing.</w:t>
+      </w:r>
+    </w:p>
+    <w:bookmarkEnd w:id="19"/>
+    <w:bookmarkStart w:id="21" w:name="education"/>
     <w:p>
       <w:pPr>
         <w:pStyle w:val="Heading2"/>
@@ -688,7 +682,7 @@
         <w:t xml:space="preserve">Education</w:t>
       </w:r>
     </w:p>
-    <w:bookmarkStart w:id="18" w:name="olympic-college"/>
+    <w:bookmarkStart w:id="20" w:name="olympic-college"/>
     <w:p>
       <w:pPr>
         <w:pStyle w:val="Heading3"/>
@@ -705,9 +699,9 @@
         <w:t xml:space="preserve">Associates Degree (A.A.S.), General Studies — 3.75 GPA / Phi Theta Kappa</w:t>
       </w:r>
     </w:p>
-    <w:bookmarkEnd w:id="18"/>
-    <w:bookmarkEnd w:id="19"/>
     <w:bookmarkEnd w:id="20"/>
+    <w:bookmarkEnd w:id="21"/>
+    <w:bookmarkEnd w:id="22"/>
     <w:sectPr>
       <w:pgMar w:bottom="540" w:footer="540" w:gutter="0" w:header="540" w:left="720" w:right="720" w:top="540"/>
       <w:footnotePr>

</xml_diff>

<commit_message>
fix(resume): escape phone parens to fix docx export
Pandoc read `(360)` as a fancy ordered-list marker, turning the
contact line into a list item and dropping the area code. Escaping the
parens keeps it as plain text in both the docx and pdf.
</commit_message>
<xml_diff>
--- a/tools/resume/resume.docx
+++ b/tools/resume/resume.docx
@@ -25,14 +25,10 @@
     </w:p>
     <w:p>
       <w:pPr>
-        <w:pStyle w:val="Compact"/>
-        <w:numPr>
-          <w:ilvl w:val="0"/>
-          <w:numId w:val="1001"/>
-        </w:numPr>
-      </w:pPr>
-      <w:r>
-        <w:t xml:space="preserve">509-8185 • jkedwards@me.com • US Person • Bainbridge Island, WA •</w:t>
+        <w:pStyle w:val="BodyText"/>
+      </w:pPr>
+      <w:r>
+        <w:t xml:space="preserve">(360) 509-8185 • jkedwards@me.com • US Person • Bainbridge Island, WA •</w:t>
       </w:r>
       <w:r>
         <w:t xml:space="preserve"> </w:t>
@@ -95,7 +91,7 @@
         <w:pStyle w:val="Compact"/>
         <w:numPr>
           <w:ilvl w:val="0"/>
-          <w:numId w:val="1002"/>
+          <w:numId w:val="1001"/>
         </w:numPr>
       </w:pPr>
       <w:r>
@@ -117,7 +113,7 @@
         <w:pStyle w:val="Compact"/>
         <w:numPr>
           <w:ilvl w:val="0"/>
-          <w:numId w:val="1002"/>
+          <w:numId w:val="1001"/>
         </w:numPr>
       </w:pPr>
       <w:r>
@@ -139,7 +135,7 @@
         <w:pStyle w:val="Compact"/>
         <w:numPr>
           <w:ilvl w:val="0"/>
-          <w:numId w:val="1002"/>
+          <w:numId w:val="1001"/>
         </w:numPr>
       </w:pPr>
       <w:r>
@@ -161,7 +157,7 @@
         <w:pStyle w:val="Compact"/>
         <w:numPr>
           <w:ilvl w:val="0"/>
-          <w:numId w:val="1002"/>
+          <w:numId w:val="1001"/>
         </w:numPr>
       </w:pPr>
       <w:r>
@@ -183,7 +179,7 @@
         <w:pStyle w:val="Compact"/>
         <w:numPr>
           <w:ilvl w:val="0"/>
-          <w:numId w:val="1002"/>
+          <w:numId w:val="1001"/>
         </w:numPr>
       </w:pPr>
       <w:r>
@@ -205,7 +201,7 @@
         <w:pStyle w:val="Compact"/>
         <w:numPr>
           <w:ilvl w:val="0"/>
-          <w:numId w:val="1002"/>
+          <w:numId w:val="1001"/>
         </w:numPr>
       </w:pPr>
       <w:r>
@@ -227,7 +223,7 @@
         <w:pStyle w:val="Compact"/>
         <w:numPr>
           <w:ilvl w:val="0"/>
-          <w:numId w:val="1002"/>
+          <w:numId w:val="1001"/>
         </w:numPr>
       </w:pPr>
       <w:r>
@@ -286,7 +282,7 @@
         <w:pStyle w:val="Compact"/>
         <w:numPr>
           <w:ilvl w:val="0"/>
-          <w:numId w:val="1003"/>
+          <w:numId w:val="1002"/>
         </w:numPr>
       </w:pPr>
       <w:r>
@@ -298,7 +294,7 @@
         <w:pStyle w:val="Compact"/>
         <w:numPr>
           <w:ilvl w:val="0"/>
-          <w:numId w:val="1003"/>
+          <w:numId w:val="1002"/>
         </w:numPr>
       </w:pPr>
       <w:r>
@@ -310,7 +306,7 @@
         <w:pStyle w:val="Compact"/>
         <w:numPr>
           <w:ilvl w:val="0"/>
-          <w:numId w:val="1003"/>
+          <w:numId w:val="1002"/>
         </w:numPr>
       </w:pPr>
       <w:r>
@@ -322,7 +318,7 @@
         <w:pStyle w:val="Compact"/>
         <w:numPr>
           <w:ilvl w:val="0"/>
-          <w:numId w:val="1003"/>
+          <w:numId w:val="1002"/>
         </w:numPr>
       </w:pPr>
       <w:r>
@@ -334,7 +330,7 @@
         <w:pStyle w:val="Compact"/>
         <w:numPr>
           <w:ilvl w:val="0"/>
-          <w:numId w:val="1003"/>
+          <w:numId w:val="1002"/>
         </w:numPr>
       </w:pPr>
       <w:r>
@@ -346,7 +342,7 @@
         <w:pStyle w:val="Compact"/>
         <w:numPr>
           <w:ilvl w:val="0"/>
-          <w:numId w:val="1003"/>
+          <w:numId w:val="1002"/>
         </w:numPr>
       </w:pPr>
       <w:r>
@@ -376,7 +372,7 @@
         <w:pStyle w:val="Compact"/>
         <w:numPr>
           <w:ilvl w:val="0"/>
-          <w:numId w:val="1004"/>
+          <w:numId w:val="1003"/>
         </w:numPr>
       </w:pPr>
       <w:r>
@@ -388,7 +384,7 @@
         <w:pStyle w:val="Compact"/>
         <w:numPr>
           <w:ilvl w:val="0"/>
-          <w:numId w:val="1004"/>
+          <w:numId w:val="1003"/>
         </w:numPr>
       </w:pPr>
       <w:r>
@@ -400,7 +396,7 @@
         <w:pStyle w:val="Compact"/>
         <w:numPr>
           <w:ilvl w:val="0"/>
-          <w:numId w:val="1004"/>
+          <w:numId w:val="1003"/>
         </w:numPr>
       </w:pPr>
       <w:r>
@@ -412,7 +408,7 @@
         <w:pStyle w:val="Compact"/>
         <w:numPr>
           <w:ilvl w:val="0"/>
-          <w:numId w:val="1004"/>
+          <w:numId w:val="1003"/>
         </w:numPr>
       </w:pPr>
       <w:r>
@@ -424,7 +420,7 @@
         <w:pStyle w:val="Compact"/>
         <w:numPr>
           <w:ilvl w:val="0"/>
-          <w:numId w:val="1004"/>
+          <w:numId w:val="1003"/>
         </w:numPr>
       </w:pPr>
       <w:r>
@@ -464,7 +460,7 @@
         <w:pStyle w:val="Compact"/>
         <w:numPr>
           <w:ilvl w:val="0"/>
-          <w:numId w:val="1005"/>
+          <w:numId w:val="1004"/>
         </w:numPr>
       </w:pPr>
       <w:r>
@@ -476,7 +472,7 @@
         <w:pStyle w:val="Compact"/>
         <w:numPr>
           <w:ilvl w:val="0"/>
-          <w:numId w:val="1005"/>
+          <w:numId w:val="1004"/>
         </w:numPr>
       </w:pPr>
       <w:r>
@@ -488,7 +484,7 @@
         <w:pStyle w:val="Compact"/>
         <w:numPr>
           <w:ilvl w:val="0"/>
-          <w:numId w:val="1005"/>
+          <w:numId w:val="1004"/>
         </w:numPr>
       </w:pPr>
       <w:r>
@@ -500,7 +496,7 @@
         <w:pStyle w:val="Compact"/>
         <w:numPr>
           <w:ilvl w:val="0"/>
-          <w:numId w:val="1005"/>
+          <w:numId w:val="1004"/>
         </w:numPr>
       </w:pPr>
       <w:r>
@@ -540,7 +536,7 @@
         <w:pStyle w:val="Compact"/>
         <w:numPr>
           <w:ilvl w:val="0"/>
-          <w:numId w:val="1006"/>
+          <w:numId w:val="1005"/>
         </w:numPr>
       </w:pPr>
       <w:r>
@@ -580,7 +576,7 @@
         <w:pStyle w:val="Compact"/>
         <w:numPr>
           <w:ilvl w:val="0"/>
-          <w:numId w:val="1007"/>
+          <w:numId w:val="1006"/>
         </w:numPr>
       </w:pPr>
       <w:r>
@@ -592,7 +588,7 @@
         <w:pStyle w:val="Compact"/>
         <w:numPr>
           <w:ilvl w:val="0"/>
-          <w:numId w:val="1007"/>
+          <w:numId w:val="1006"/>
         </w:numPr>
       </w:pPr>
       <w:r>
@@ -604,7 +600,7 @@
         <w:pStyle w:val="Compact"/>
         <w:numPr>
           <w:ilvl w:val="0"/>
-          <w:numId w:val="1007"/>
+          <w:numId w:val="1006"/>
         </w:numPr>
       </w:pPr>
       <w:r>
@@ -616,7 +612,7 @@
         <w:pStyle w:val="Compact"/>
         <w:numPr>
           <w:ilvl w:val="0"/>
-          <w:numId w:val="1007"/>
+          <w:numId w:val="1006"/>
         </w:numPr>
       </w:pPr>
       <w:r>
@@ -628,7 +624,7 @@
         <w:pStyle w:val="Compact"/>
         <w:numPr>
           <w:ilvl w:val="0"/>
-          <w:numId w:val="1007"/>
+          <w:numId w:val="1006"/>
         </w:numPr>
       </w:pPr>
       <w:r>
@@ -813,91 +809,6 @@
       </w:pPr>
     </w:lvl>
   </w:abstractNum>
-  <w:abstractNum w:abstractNumId="9943360">
-    <w:nsid w:val="A9943360"/>
-    <w:multiLevelType w:val="multilevel"/>
-    <w:lvl w:ilvl="0">
-      <w:start w:val="360"/>
-      <w:numFmt w:val="decimal"/>
-      <w:lvlText w:val="(%1)"/>
-      <w:lvlJc w:val="left"/>
-      <w:pPr>
-        <w:ind w:left="720" w:hanging="360"/>
-      </w:pPr>
-    </w:lvl>
-    <w:lvl w:ilvl="1">
-      <w:start w:val="360"/>
-      <w:numFmt w:val="decimal"/>
-      <w:lvlText w:val="(%2)"/>
-      <w:lvlJc w:val="left"/>
-      <w:pPr>
-        <w:ind w:left="1440" w:hanging="360"/>
-      </w:pPr>
-    </w:lvl>
-    <w:lvl w:ilvl="2">
-      <w:start w:val="360"/>
-      <w:numFmt w:val="decimal"/>
-      <w:lvlText w:val="(%3)"/>
-      <w:lvlJc w:val="left"/>
-      <w:pPr>
-        <w:ind w:left="2160" w:hanging="360"/>
-      </w:pPr>
-    </w:lvl>
-    <w:lvl w:ilvl="3">
-      <w:start w:val="360"/>
-      <w:numFmt w:val="decimal"/>
-      <w:lvlText w:val="(%4)"/>
-      <w:lvlJc w:val="left"/>
-      <w:pPr>
-        <w:ind w:left="2880" w:hanging="360"/>
-      </w:pPr>
-    </w:lvl>
-    <w:lvl w:ilvl="4">
-      <w:start w:val="360"/>
-      <w:numFmt w:val="decimal"/>
-      <w:lvlText w:val="(%5)"/>
-      <w:lvlJc w:val="left"/>
-      <w:pPr>
-        <w:ind w:left="3600" w:hanging="360"/>
-      </w:pPr>
-    </w:lvl>
-    <w:lvl w:ilvl="5">
-      <w:start w:val="360"/>
-      <w:numFmt w:val="decimal"/>
-      <w:lvlText w:val="(%6)"/>
-      <w:lvlJc w:val="left"/>
-      <w:pPr>
-        <w:ind w:left="4320" w:hanging="360"/>
-      </w:pPr>
-    </w:lvl>
-    <w:lvl w:ilvl="6">
-      <w:start w:val="360"/>
-      <w:numFmt w:val="decimal"/>
-      <w:lvlText w:val="(%7)"/>
-      <w:lvlJc w:val="left"/>
-      <w:pPr>
-        <w:ind w:left="5040" w:hanging="360"/>
-      </w:pPr>
-    </w:lvl>
-    <w:lvl w:ilvl="7">
-      <w:start w:val="360"/>
-      <w:numFmt w:val="decimal"/>
-      <w:lvlText w:val="(%8)"/>
-      <w:lvlJc w:val="left"/>
-      <w:pPr>
-        <w:ind w:left="5760" w:hanging="360"/>
-      </w:pPr>
-    </w:lvl>
-    <w:lvl w:ilvl="8">
-      <w:start w:val="360"/>
-      <w:numFmt w:val="decimal"/>
-      <w:lvlText w:val="(%9)"/>
-      <w:lvlJc w:val="left"/>
-      <w:pPr>
-        <w:ind w:left="6480" w:hanging="360"/>
-      </w:pPr>
-    </w:lvl>
-  </w:abstractNum>
   <w:abstractNum w:abstractNumId="991">
     <w:nsid w:val="0000A991"/>
     <w:multiLevelType w:val="multilevel"/>
@@ -1005,34 +916,7 @@
     <w:abstractNumId w:val="990"/>
   </w:num>
   <w:num w:numId="1001">
-    <w:abstractNumId w:val="9943360"/>
-    <w:lvlOverride w:ilvl="0">
-      <w:startOverride w:val="360"/>
-    </w:lvlOverride>
-    <w:lvlOverride w:ilvl="1">
-      <w:startOverride w:val="360"/>
-    </w:lvlOverride>
-    <w:lvlOverride w:ilvl="2">
-      <w:startOverride w:val="360"/>
-    </w:lvlOverride>
-    <w:lvlOverride w:ilvl="3">
-      <w:startOverride w:val="360"/>
-    </w:lvlOverride>
-    <w:lvlOverride w:ilvl="4">
-      <w:startOverride w:val="360"/>
-    </w:lvlOverride>
-    <w:lvlOverride w:ilvl="5">
-      <w:startOverride w:val="360"/>
-    </w:lvlOverride>
-    <w:lvlOverride w:ilvl="6">
-      <w:startOverride w:val="360"/>
-    </w:lvlOverride>
-    <w:lvlOverride w:ilvl="7">
-      <w:startOverride w:val="360"/>
-    </w:lvlOverride>
-    <w:lvlOverride w:ilvl="8">
-      <w:startOverride w:val="360"/>
-    </w:lvlOverride>
+    <w:abstractNumId w:val="991"/>
   </w:num>
   <w:num w:numId="1002">
     <w:abstractNumId w:val="991"/>
@@ -1047,9 +931,6 @@
     <w:abstractNumId w:val="991"/>
   </w:num>
   <w:num w:numId="1006">
-    <w:abstractNumId w:val="991"/>
-  </w:num>
-  <w:num w:numId="1007">
     <w:abstractNumId w:val="991"/>
   </w:num>
 </w:numbering>

</xml_diff>

<commit_message>
docs(resume): refresh experience and skills content
</commit_message>
<xml_diff>
--- a/tools/resume/resume.docx
+++ b/tools/resume/resume.docx
@@ -73,7 +73,7 @@
         <w:pStyle w:val="FirstParagraph"/>
       </w:pPr>
       <w:r>
-        <w:t xml:space="preserve">Business-minded software-engineering leader practicing end-to-end product engineering on streaming data platforms over datasets in the hundreds of millions of records and modernizing developer platforms with Nix and monorepo tooling. In the past year, shipped a Flow-Based Programming data graph (~2.5M events/day and growing), a Property and People data delivery platform that unlocked $1M in net new revenue and new categories of products, and Scala load shedding for a high-traffic search layer. 11+ years bridging deep IC and engineering leadership; has managed teams of up to 12 ICs.</w:t>
+        <w:t xml:space="preserve">Business-minded software-engineering leader practicing end-to-end product engineering on streaming data platforms over datasets in the hundreds of millions of records and modernizing developer platforms with Nix and monorepo tooling. In the past year, shipped a Flow-Based Programming data graph (~2.5M events/day and growing), a Property and People data delivery platform that unlocked $1M in net new revenue and, and Scala load shedding for a high-traffic search layer. 11+ years bridging deep IC and engineering leadership; has managed teams of up to 12 ICs.</w:t>
       </w:r>
     </w:p>
     <w:bookmarkEnd w:id="11"/>
@@ -105,7 +105,7 @@
         <w:t xml:space="preserve"> </w:t>
       </w:r>
       <w:r>
-        <w:t xml:space="preserve">team management, mentorship, high-volume substantive code review, engineering governance</w:t>
+        <w:t xml:space="preserve">team management, mentorship, high-volume substantive code review, system design, architectural direction</w:t>
       </w:r>
     </w:p>
     <w:p>
@@ -286,7 +286,7 @@
         </w:numPr>
       </w:pPr>
       <w:r>
-        <w:t xml:space="preserve">Tripled team commit throughput year-over-year (CRO tickets, bug fixes, feature requests, and new tooling) by pairing hands-on mentorship with operationalized agentic AI and a robust spec process, leaving the team running ahead of business demand despite shrinking headcount.</w:t>
+        <w:t xml:space="preserve">Tripled team commit throughput year-over-year (conversion-rate optimization tickets, bug fixes, feature requests, and new tooling) by pairing hands-on mentorship with operationalized agentic AI and a robust spec process, leaving the team running ahead of business demand despite shrinking headcount.</w:t>
       </w:r>
     </w:p>
     <w:p>
@@ -334,7 +334,7 @@
         </w:numPr>
       </w:pPr>
       <w:r>
-        <w:t xml:space="preserve">Built MCP integration and AI inference harness on the engineering platform; authored org-wide documentation to establish AI-assisted engineering practice.</w:t>
+        <w:t xml:space="preserve">Built MCP integration and AI inference harness on the engineering platform which allowed non-engineers to truly explore our raw data for the first time and unlock product research.</w:t>
       </w:r>
     </w:p>
     <w:p>
@@ -346,7 +346,19 @@
         </w:numPr>
       </w:pPr>
       <w:r>
-        <w:t xml:space="preserve">Sustained high-volume, substantive peer code review across the platform org: 261 reviews in the first 15 weeks of 2026 alone (~75/month, mean 6 / median 4 comments per PR, ~1,000-line PR average), reinforcing engineering standards.</w:t>
+        <w:t xml:space="preserve">Authored org-wide documentation to establish AI-assisted engineering practice to set expectations and governance.</w:t>
+      </w:r>
+    </w:p>
+    <w:p>
+      <w:pPr>
+        <w:pStyle w:val="Compact"/>
+        <w:numPr>
+          <w:ilvl w:val="0"/>
+          <w:numId w:val="1002"/>
+        </w:numPr>
+      </w:pPr>
+      <w:r>
+        <w:t xml:space="preserve">Sustained high-volume, substantive peer code review across the platform org: 261 reviews in the first 15 weeks of 2026 alone (~75/month, mean 6 / median 4 comments per PR, ~1,000-line PR average), reinforcing engineering standards and coaching/developing the engineering team overall.</w:t>
       </w:r>
     </w:p>
     <w:p>
@@ -376,6 +388,18 @@
         </w:numPr>
       </w:pPr>
       <w:r>
+        <w:t xml:space="preserve">Returned to the IC track in Jun 2023 to focus on data platform architecture.</w:t>
+      </w:r>
+    </w:p>
+    <w:p>
+      <w:pPr>
+        <w:pStyle w:val="Compact"/>
+        <w:numPr>
+          <w:ilvl w:val="0"/>
+          <w:numId w:val="1003"/>
+        </w:numPr>
+      </w:pPr>
+      <w:r>
         <w:t xml:space="preserve">Reversed a multi-quarter decline in Google indexation and increased indexed page count by more than 30%.</w:t>
       </w:r>
     </w:p>
@@ -413,18 +437,6 @@
       </w:pPr>
       <w:r>
         <w:t xml:space="preserve">Managed and mentored a team of 6 engineers on the consumer web platform and mobile app team (SEO, Core Web Vitals, conversion optimization, legal compliance), leading delivery on LCP regression fixes for high-traffic page types, INP tracking ahead of Google’s CWV INP rollout, and an org-wide cookie consent rollout.</w:t>
-      </w:r>
-    </w:p>
-    <w:p>
-      <w:pPr>
-        <w:pStyle w:val="Compact"/>
-        <w:numPr>
-          <w:ilvl w:val="0"/>
-          <w:numId w:val="1003"/>
-        </w:numPr>
-      </w:pPr>
-      <w:r>
-        <w:t xml:space="preserve">Returned to the IC track in Jun 2023 to focus on data platform architecture.</w:t>
       </w:r>
     </w:p>
     <w:bookmarkEnd w:id="13"/>
@@ -540,7 +552,7 @@
         </w:numPr>
       </w:pPr>
       <w:r>
-        <w:t xml:space="preserve">Extended a Cordova mobile application, built React Native and Flutter proof-of-concept apps, and created a test automation framework.</w:t>
+        <w:t xml:space="preserve">Added third-party services to a Cordova mobile application which added a brand new subscription revenue stream to the Linksys product family, built React Native and Flutter proof-of-concept apps, and created a test automation framework.</w:t>
       </w:r>
     </w:p>
     <w:bookmarkEnd w:id="15"/>

</xml_diff>

<commit_message>
feat(tools/resume): canonical profile.cue, generate resume.md
profile.cue (validated by schema/profile.cue) becomes the single source
for the profile prose shared with the portfolio's about page — identity,
contact, summary, skills, education. resume.md's profile sections now sit
in `shaka profile generate` managed regions; the work-experience
sections between them stay hand-authored, since the résumé is a tightened
distillation of the portfolio's richer work history.

Reconciles prior drift (e.g. a duplicated "revenue and, and" typo) to a
single canonical value.
</commit_message>
<xml_diff>
--- a/tools/resume/resume.docx
+++ b/tools/resume/resume.docx
@@ -25,10 +25,14 @@
     </w:p>
     <w:p>
       <w:pPr>
-        <w:pStyle w:val="BodyText"/>
-      </w:pPr>
-      <w:r>
-        <w:t xml:space="preserve">(360) 509-8185 • jkedwards@me.com • US Person • Bainbridge Island, WA •</w:t>
+        <w:pStyle w:val="Compact"/>
+        <w:numPr>
+          <w:ilvl w:val="0"/>
+          <w:numId w:val="1001"/>
+        </w:numPr>
+      </w:pPr>
+      <w:r>
+        <w:t xml:space="preserve">509-8185 • jkedwards@me.com • US Person • Bainbridge Island, WA •</w:t>
       </w:r>
       <w:r>
         <w:t xml:space="preserve"> </w:t>
@@ -73,7 +77,7 @@
         <w:pStyle w:val="FirstParagraph"/>
       </w:pPr>
       <w:r>
-        <w:t xml:space="preserve">Business-minded software-engineering leader practicing end-to-end product engineering on streaming data platforms over datasets in the hundreds of millions of records and modernizing developer platforms with Nix and monorepo tooling. In the past year, shipped a Flow-Based Programming data graph (~2.5M events/day and growing), a Property and People data delivery platform that unlocked $1M in net new revenue and, and Scala load shedding for a high-traffic search layer. 11+ years bridging deep IC and engineering leadership; has managed teams of up to 12 ICs.</w:t>
+        <w:t xml:space="preserve">Business-minded software-engineering leader practicing end-to-end product engineering on streaming data platforms over datasets in the hundreds of millions of records and modernizing developer platforms with Nix and monorepo tooling. In the past year, shipped a Flow-Based Programming data graph (~2.5M events/day and growing), a Property and People data delivery platform that unlocked $1M in net new revenue, and Scala load shedding for a high-traffic search layer. 11+ years bridging deep IC and engineering leadership; has managed teams of up to 12 ICs.</w:t>
       </w:r>
     </w:p>
     <w:bookmarkEnd w:id="11"/>
@@ -91,7 +95,7 @@
         <w:pStyle w:val="Compact"/>
         <w:numPr>
           <w:ilvl w:val="0"/>
-          <w:numId w:val="1001"/>
+          <w:numId w:val="1002"/>
         </w:numPr>
       </w:pPr>
       <w:r>
@@ -113,7 +117,7 @@
         <w:pStyle w:val="Compact"/>
         <w:numPr>
           <w:ilvl w:val="0"/>
-          <w:numId w:val="1001"/>
+          <w:numId w:val="1002"/>
         </w:numPr>
       </w:pPr>
       <w:r>
@@ -135,7 +139,7 @@
         <w:pStyle w:val="Compact"/>
         <w:numPr>
           <w:ilvl w:val="0"/>
-          <w:numId w:val="1001"/>
+          <w:numId w:val="1002"/>
         </w:numPr>
       </w:pPr>
       <w:r>
@@ -157,7 +161,7 @@
         <w:pStyle w:val="Compact"/>
         <w:numPr>
           <w:ilvl w:val="0"/>
-          <w:numId w:val="1001"/>
+          <w:numId w:val="1002"/>
         </w:numPr>
       </w:pPr>
       <w:r>
@@ -179,7 +183,7 @@
         <w:pStyle w:val="Compact"/>
         <w:numPr>
           <w:ilvl w:val="0"/>
-          <w:numId w:val="1001"/>
+          <w:numId w:val="1002"/>
         </w:numPr>
       </w:pPr>
       <w:r>
@@ -201,7 +205,7 @@
         <w:pStyle w:val="Compact"/>
         <w:numPr>
           <w:ilvl w:val="0"/>
-          <w:numId w:val="1001"/>
+          <w:numId w:val="1002"/>
         </w:numPr>
       </w:pPr>
       <w:r>
@@ -223,7 +227,7 @@
         <w:pStyle w:val="Compact"/>
         <w:numPr>
           <w:ilvl w:val="0"/>
-          <w:numId w:val="1001"/>
+          <w:numId w:val="1002"/>
         </w:numPr>
       </w:pPr>
       <w:r>
@@ -282,7 +286,7 @@
         <w:pStyle w:val="Compact"/>
         <w:numPr>
           <w:ilvl w:val="0"/>
-          <w:numId w:val="1002"/>
+          <w:numId w:val="1003"/>
         </w:numPr>
       </w:pPr>
       <w:r>
@@ -294,7 +298,7 @@
         <w:pStyle w:val="Compact"/>
         <w:numPr>
           <w:ilvl w:val="0"/>
-          <w:numId w:val="1002"/>
+          <w:numId w:val="1003"/>
         </w:numPr>
       </w:pPr>
       <w:r>
@@ -306,7 +310,7 @@
         <w:pStyle w:val="Compact"/>
         <w:numPr>
           <w:ilvl w:val="0"/>
-          <w:numId w:val="1002"/>
+          <w:numId w:val="1003"/>
         </w:numPr>
       </w:pPr>
       <w:r>
@@ -318,7 +322,7 @@
         <w:pStyle w:val="Compact"/>
         <w:numPr>
           <w:ilvl w:val="0"/>
-          <w:numId w:val="1002"/>
+          <w:numId w:val="1003"/>
         </w:numPr>
       </w:pPr>
       <w:r>
@@ -330,7 +334,7 @@
         <w:pStyle w:val="Compact"/>
         <w:numPr>
           <w:ilvl w:val="0"/>
-          <w:numId w:val="1002"/>
+          <w:numId w:val="1003"/>
         </w:numPr>
       </w:pPr>
       <w:r>
@@ -342,7 +346,7 @@
         <w:pStyle w:val="Compact"/>
         <w:numPr>
           <w:ilvl w:val="0"/>
-          <w:numId w:val="1002"/>
+          <w:numId w:val="1003"/>
         </w:numPr>
       </w:pPr>
       <w:r>
@@ -354,7 +358,7 @@
         <w:pStyle w:val="Compact"/>
         <w:numPr>
           <w:ilvl w:val="0"/>
-          <w:numId w:val="1002"/>
+          <w:numId w:val="1003"/>
         </w:numPr>
       </w:pPr>
       <w:r>
@@ -384,7 +388,7 @@
         <w:pStyle w:val="Compact"/>
         <w:numPr>
           <w:ilvl w:val="0"/>
-          <w:numId w:val="1003"/>
+          <w:numId w:val="1004"/>
         </w:numPr>
       </w:pPr>
       <w:r>
@@ -396,7 +400,7 @@
         <w:pStyle w:val="Compact"/>
         <w:numPr>
           <w:ilvl w:val="0"/>
-          <w:numId w:val="1003"/>
+          <w:numId w:val="1004"/>
         </w:numPr>
       </w:pPr>
       <w:r>
@@ -408,7 +412,7 @@
         <w:pStyle w:val="Compact"/>
         <w:numPr>
           <w:ilvl w:val="0"/>
-          <w:numId w:val="1003"/>
+          <w:numId w:val="1004"/>
         </w:numPr>
       </w:pPr>
       <w:r>
@@ -420,7 +424,7 @@
         <w:pStyle w:val="Compact"/>
         <w:numPr>
           <w:ilvl w:val="0"/>
-          <w:numId w:val="1003"/>
+          <w:numId w:val="1004"/>
         </w:numPr>
       </w:pPr>
       <w:r>
@@ -432,7 +436,7 @@
         <w:pStyle w:val="Compact"/>
         <w:numPr>
           <w:ilvl w:val="0"/>
-          <w:numId w:val="1003"/>
+          <w:numId w:val="1004"/>
         </w:numPr>
       </w:pPr>
       <w:r>
@@ -472,7 +476,7 @@
         <w:pStyle w:val="Compact"/>
         <w:numPr>
           <w:ilvl w:val="0"/>
-          <w:numId w:val="1004"/>
+          <w:numId w:val="1005"/>
         </w:numPr>
       </w:pPr>
       <w:r>
@@ -484,7 +488,7 @@
         <w:pStyle w:val="Compact"/>
         <w:numPr>
           <w:ilvl w:val="0"/>
-          <w:numId w:val="1004"/>
+          <w:numId w:val="1005"/>
         </w:numPr>
       </w:pPr>
       <w:r>
@@ -496,7 +500,7 @@
         <w:pStyle w:val="Compact"/>
         <w:numPr>
           <w:ilvl w:val="0"/>
-          <w:numId w:val="1004"/>
+          <w:numId w:val="1005"/>
         </w:numPr>
       </w:pPr>
       <w:r>
@@ -508,7 +512,7 @@
         <w:pStyle w:val="Compact"/>
         <w:numPr>
           <w:ilvl w:val="0"/>
-          <w:numId w:val="1004"/>
+          <w:numId w:val="1005"/>
         </w:numPr>
       </w:pPr>
       <w:r>
@@ -548,7 +552,7 @@
         <w:pStyle w:val="Compact"/>
         <w:numPr>
           <w:ilvl w:val="0"/>
-          <w:numId w:val="1005"/>
+          <w:numId w:val="1006"/>
         </w:numPr>
       </w:pPr>
       <w:r>
@@ -588,7 +592,7 @@
         <w:pStyle w:val="Compact"/>
         <w:numPr>
           <w:ilvl w:val="0"/>
-          <w:numId w:val="1006"/>
+          <w:numId w:val="1007"/>
         </w:numPr>
       </w:pPr>
       <w:r>
@@ -600,7 +604,7 @@
         <w:pStyle w:val="Compact"/>
         <w:numPr>
           <w:ilvl w:val="0"/>
-          <w:numId w:val="1006"/>
+          <w:numId w:val="1007"/>
         </w:numPr>
       </w:pPr>
       <w:r>
@@ -612,7 +616,7 @@
         <w:pStyle w:val="Compact"/>
         <w:numPr>
           <w:ilvl w:val="0"/>
-          <w:numId w:val="1006"/>
+          <w:numId w:val="1007"/>
         </w:numPr>
       </w:pPr>
       <w:r>
@@ -624,7 +628,7 @@
         <w:pStyle w:val="Compact"/>
         <w:numPr>
           <w:ilvl w:val="0"/>
-          <w:numId w:val="1006"/>
+          <w:numId w:val="1007"/>
         </w:numPr>
       </w:pPr>
       <w:r>
@@ -636,7 +640,7 @@
         <w:pStyle w:val="Compact"/>
         <w:numPr>
           <w:ilvl w:val="0"/>
-          <w:numId w:val="1006"/>
+          <w:numId w:val="1007"/>
         </w:numPr>
       </w:pPr>
       <w:r>
@@ -821,6 +825,91 @@
       </w:pPr>
     </w:lvl>
   </w:abstractNum>
+  <w:abstractNum w:abstractNumId="9943360">
+    <w:nsid w:val="A9943360"/>
+    <w:multiLevelType w:val="multilevel"/>
+    <w:lvl w:ilvl="0">
+      <w:start w:val="360"/>
+      <w:numFmt w:val="decimal"/>
+      <w:lvlText w:val="(%1)"/>
+      <w:lvlJc w:val="left"/>
+      <w:pPr>
+        <w:ind w:left="720" w:hanging="360"/>
+      </w:pPr>
+    </w:lvl>
+    <w:lvl w:ilvl="1">
+      <w:start w:val="360"/>
+      <w:numFmt w:val="decimal"/>
+      <w:lvlText w:val="(%2)"/>
+      <w:lvlJc w:val="left"/>
+      <w:pPr>
+        <w:ind w:left="1440" w:hanging="360"/>
+      </w:pPr>
+    </w:lvl>
+    <w:lvl w:ilvl="2">
+      <w:start w:val="360"/>
+      <w:numFmt w:val="decimal"/>
+      <w:lvlText w:val="(%3)"/>
+      <w:lvlJc w:val="left"/>
+      <w:pPr>
+        <w:ind w:left="2160" w:hanging="360"/>
+      </w:pPr>
+    </w:lvl>
+    <w:lvl w:ilvl="3">
+      <w:start w:val="360"/>
+      <w:numFmt w:val="decimal"/>
+      <w:lvlText w:val="(%4)"/>
+      <w:lvlJc w:val="left"/>
+      <w:pPr>
+        <w:ind w:left="2880" w:hanging="360"/>
+      </w:pPr>
+    </w:lvl>
+    <w:lvl w:ilvl="4">
+      <w:start w:val="360"/>
+      <w:numFmt w:val="decimal"/>
+      <w:lvlText w:val="(%5)"/>
+      <w:lvlJc w:val="left"/>
+      <w:pPr>
+        <w:ind w:left="3600" w:hanging="360"/>
+      </w:pPr>
+    </w:lvl>
+    <w:lvl w:ilvl="5">
+      <w:start w:val="360"/>
+      <w:numFmt w:val="decimal"/>
+      <w:lvlText w:val="(%6)"/>
+      <w:lvlJc w:val="left"/>
+      <w:pPr>
+        <w:ind w:left="4320" w:hanging="360"/>
+      </w:pPr>
+    </w:lvl>
+    <w:lvl w:ilvl="6">
+      <w:start w:val="360"/>
+      <w:numFmt w:val="decimal"/>
+      <w:lvlText w:val="(%7)"/>
+      <w:lvlJc w:val="left"/>
+      <w:pPr>
+        <w:ind w:left="5040" w:hanging="360"/>
+      </w:pPr>
+    </w:lvl>
+    <w:lvl w:ilvl="7">
+      <w:start w:val="360"/>
+      <w:numFmt w:val="decimal"/>
+      <w:lvlText w:val="(%8)"/>
+      <w:lvlJc w:val="left"/>
+      <w:pPr>
+        <w:ind w:left="5760" w:hanging="360"/>
+      </w:pPr>
+    </w:lvl>
+    <w:lvl w:ilvl="8">
+      <w:start w:val="360"/>
+      <w:numFmt w:val="decimal"/>
+      <w:lvlText w:val="(%9)"/>
+      <w:lvlJc w:val="left"/>
+      <w:pPr>
+        <w:ind w:left="6480" w:hanging="360"/>
+      </w:pPr>
+    </w:lvl>
+  </w:abstractNum>
   <w:abstractNum w:abstractNumId="991">
     <w:nsid w:val="0000A991"/>
     <w:multiLevelType w:val="multilevel"/>
@@ -928,7 +1017,34 @@
     <w:abstractNumId w:val="990"/>
   </w:num>
   <w:num w:numId="1001">
-    <w:abstractNumId w:val="991"/>
+    <w:abstractNumId w:val="9943360"/>
+    <w:lvlOverride w:ilvl="0">
+      <w:startOverride w:val="360"/>
+    </w:lvlOverride>
+    <w:lvlOverride w:ilvl="1">
+      <w:startOverride w:val="360"/>
+    </w:lvlOverride>
+    <w:lvlOverride w:ilvl="2">
+      <w:startOverride w:val="360"/>
+    </w:lvlOverride>
+    <w:lvlOverride w:ilvl="3">
+      <w:startOverride w:val="360"/>
+    </w:lvlOverride>
+    <w:lvlOverride w:ilvl="4">
+      <w:startOverride w:val="360"/>
+    </w:lvlOverride>
+    <w:lvlOverride w:ilvl="5">
+      <w:startOverride w:val="360"/>
+    </w:lvlOverride>
+    <w:lvlOverride w:ilvl="6">
+      <w:startOverride w:val="360"/>
+    </w:lvlOverride>
+    <w:lvlOverride w:ilvl="7">
+      <w:startOverride w:val="360"/>
+    </w:lvlOverride>
+    <w:lvlOverride w:ilvl="8">
+      <w:startOverride w:val="360"/>
+    </w:lvlOverride>
   </w:num>
   <w:num w:numId="1002">
     <w:abstractNumId w:val="991"/>
@@ -943,6 +1059,9 @@
     <w:abstractNumId w:val="991"/>
   </w:num>
   <w:num w:numId="1006">
+    <w:abstractNumId w:val="991"/>
+  </w:num>
+  <w:num w:numId="1007">
     <w:abstractNumId w:val="991"/>
   </w:num>
 </w:numbering>

</xml_diff>